<commit_message>
Redesign Home page with hero banner, body cards, and amber note boxes
Co-Authored-By: Claude Sonnet 4.6 <noreply@anthropic.com>
</commit_message>
<xml_diff>
--- a/src/survey_tools/API_Discovery_Data_Collection_Guide_.docx
+++ b/src/survey_tools/API_Discovery_Data_Collection_Guide_.docx
@@ -211,12 +211,6 @@
         <w:gridCol w:w="6560"/>
       </w:tblGrid>
       <w:tr>
-        <w:tblPrEx>
-          <w:tblCellMar>
-            <w:top w:w="0" w:type="dxa"/>
-            <w:bottom w:w="0" w:type="dxa"/>
-          </w:tblCellMar>
-        </w:tblPrEx>
         <w:tc>
           <w:tcPr>
             <w:tcW w:w="2800" w:type="dxa"/>
@@ -278,12 +272,6 @@
         </w:tc>
       </w:tr>
       <w:tr>
-        <w:tblPrEx>
-          <w:tblCellMar>
-            <w:top w:w="0" w:type="dxa"/>
-            <w:bottom w:w="0" w:type="dxa"/>
-          </w:tblCellMar>
-        </w:tblPrEx>
         <w:tc>
           <w:tcPr>
             <w:tcW w:w="2800" w:type="dxa"/>
@@ -345,12 +333,6 @@
         </w:tc>
       </w:tr>
       <w:tr>
-        <w:tblPrEx>
-          <w:tblCellMar>
-            <w:top w:w="0" w:type="dxa"/>
-            <w:bottom w:w="0" w:type="dxa"/>
-          </w:tblCellMar>
-        </w:tblPrEx>
         <w:tc>
           <w:tcPr>
             <w:tcW w:w="2800" w:type="dxa"/>
@@ -412,12 +394,6 @@
         </w:tc>
       </w:tr>
       <w:tr>
-        <w:tblPrEx>
-          <w:tblCellMar>
-            <w:top w:w="0" w:type="dxa"/>
-            <w:bottom w:w="0" w:type="dxa"/>
-          </w:tblCellMar>
-        </w:tblPrEx>
         <w:tc>
           <w:tcPr>
             <w:tcW w:w="2800" w:type="dxa"/>
@@ -479,12 +455,6 @@
         </w:tc>
       </w:tr>
       <w:tr>
-        <w:tblPrEx>
-          <w:tblCellMar>
-            <w:top w:w="0" w:type="dxa"/>
-            <w:bottom w:w="0" w:type="dxa"/>
-          </w:tblCellMar>
-        </w:tblPrEx>
         <w:tc>
           <w:tcPr>
             <w:tcW w:w="2800" w:type="dxa"/>
@@ -546,12 +516,6 @@
         </w:tc>
       </w:tr>
       <w:tr>
-        <w:tblPrEx>
-          <w:tblCellMar>
-            <w:top w:w="0" w:type="dxa"/>
-            <w:bottom w:w="0" w:type="dxa"/>
-          </w:tblCellMar>
-        </w:tblPrEx>
         <w:tc>
           <w:tcPr>
             <w:tcW w:w="2800" w:type="dxa"/>
@@ -613,12 +577,6 @@
         </w:tc>
       </w:tr>
       <w:tr>
-        <w:tblPrEx>
-          <w:tblCellMar>
-            <w:top w:w="0" w:type="dxa"/>
-            <w:bottom w:w="0" w:type="dxa"/>
-          </w:tblCellMar>
-        </w:tblPrEx>
         <w:tc>
           <w:tcPr>
             <w:tcW w:w="2800" w:type="dxa"/>
@@ -680,12 +638,6 @@
         </w:tc>
       </w:tr>
       <w:tr>
-        <w:tblPrEx>
-          <w:tblCellMar>
-            <w:top w:w="0" w:type="dxa"/>
-            <w:bottom w:w="0" w:type="dxa"/>
-          </w:tblCellMar>
-        </w:tblPrEx>
         <w:tc>
           <w:tcPr>
             <w:tcW w:w="2800" w:type="dxa"/>
@@ -807,12 +759,6 @@
         </w:tc>
       </w:tr>
       <w:tr>
-        <w:tblPrEx>
-          <w:tblCellMar>
-            <w:top w:w="0" w:type="dxa"/>
-            <w:bottom w:w="0" w:type="dxa"/>
-          </w:tblCellMar>
-        </w:tblPrEx>
         <w:tc>
           <w:tcPr>
             <w:tcW w:w="2800" w:type="dxa"/>
@@ -934,12 +880,6 @@
         </w:tc>
       </w:tr>
       <w:tr>
-        <w:tblPrEx>
-          <w:tblCellMar>
-            <w:top w:w="0" w:type="dxa"/>
-            <w:bottom w:w="0" w:type="dxa"/>
-          </w:tblCellMar>
-        </w:tblPrEx>
         <w:tc>
           <w:tcPr>
             <w:tcW w:w="2800" w:type="dxa"/>
@@ -1026,12 +966,6 @@
         </w:tc>
       </w:tr>
       <w:tr>
-        <w:tblPrEx>
-          <w:tblCellMar>
-            <w:top w:w="0" w:type="dxa"/>
-            <w:bottom w:w="0" w:type="dxa"/>
-          </w:tblCellMar>
-        </w:tblPrEx>
         <w:tc>
           <w:tcPr>
             <w:tcW w:w="2800" w:type="dxa"/>
@@ -1177,12 +1111,6 @@
         </w:tc>
       </w:tr>
       <w:tr>
-        <w:tblPrEx>
-          <w:tblCellMar>
-            <w:top w:w="0" w:type="dxa"/>
-            <w:bottom w:w="0" w:type="dxa"/>
-          </w:tblCellMar>
-        </w:tblPrEx>
         <w:tc>
           <w:tcPr>
             <w:tcW w:w="2800" w:type="dxa"/>
@@ -1331,12 +1259,6 @@
         <w:gridCol w:w="6560"/>
       </w:tblGrid>
       <w:tr>
-        <w:tblPrEx>
-          <w:tblCellMar>
-            <w:top w:w="0" w:type="dxa"/>
-            <w:bottom w:w="0" w:type="dxa"/>
-          </w:tblCellMar>
-        </w:tblPrEx>
         <w:tc>
           <w:tcPr>
             <w:tcW w:w="2800" w:type="dxa"/>
@@ -1398,12 +1320,6 @@
         </w:tc>
       </w:tr>
       <w:tr>
-        <w:tblPrEx>
-          <w:tblCellMar>
-            <w:top w:w="0" w:type="dxa"/>
-            <w:bottom w:w="0" w:type="dxa"/>
-          </w:tblCellMar>
-        </w:tblPrEx>
         <w:tc>
           <w:tcPr>
             <w:tcW w:w="2800" w:type="dxa"/>
@@ -1465,12 +1381,6 @@
         </w:tc>
       </w:tr>
       <w:tr>
-        <w:tblPrEx>
-          <w:tblCellMar>
-            <w:top w:w="0" w:type="dxa"/>
-            <w:bottom w:w="0" w:type="dxa"/>
-          </w:tblCellMar>
-        </w:tblPrEx>
         <w:tc>
           <w:tcPr>
             <w:tcW w:w="2800" w:type="dxa"/>
@@ -1544,12 +1454,6 @@
         </w:tc>
       </w:tr>
       <w:tr>
-        <w:tblPrEx>
-          <w:tblCellMar>
-            <w:top w:w="0" w:type="dxa"/>
-            <w:bottom w:w="0" w:type="dxa"/>
-          </w:tblCellMar>
-        </w:tblPrEx>
         <w:tc>
           <w:tcPr>
             <w:tcW w:w="2800" w:type="dxa"/>
@@ -1623,12 +1527,6 @@
         </w:tc>
       </w:tr>
       <w:tr>
-        <w:tblPrEx>
-          <w:tblCellMar>
-            <w:top w:w="0" w:type="dxa"/>
-            <w:bottom w:w="0" w:type="dxa"/>
-          </w:tblCellMar>
-        </w:tblPrEx>
         <w:tc>
           <w:tcPr>
             <w:tcW w:w="2800" w:type="dxa"/>
@@ -1736,11 +1634,6 @@
         <w:t>Select all methods your system supports, then complete Section 2.3.</w:t>
       </w:r>
     </w:p>
-    <w:p>
-      <w:pPr>
-        <w:spacing w:before="60" w:after="60"/>
-      </w:pPr>
-    </w:p>
     <w:tbl>
       <w:tblPr>
         <w:tblW w:w="9360" w:type="dxa"/>
@@ -1764,12 +1657,6 @@
         <w:gridCol w:w="4360"/>
       </w:tblGrid>
       <w:tr>
-        <w:tblPrEx>
-          <w:tblCellMar>
-            <w:top w:w="0" w:type="dxa"/>
-            <w:bottom w:w="0" w:type="dxa"/>
-          </w:tblCellMar>
-        </w:tblPrEx>
         <w:trPr>
           <w:tblHeader/>
         </w:trPr>
@@ -1865,12 +1752,6 @@
         </w:tc>
       </w:tr>
       <w:tr>
-        <w:tblPrEx>
-          <w:tblCellMar>
-            <w:top w:w="0" w:type="dxa"/>
-            <w:bottom w:w="0" w:type="dxa"/>
-          </w:tblCellMar>
-        </w:tblPrEx>
         <w:tc>
           <w:tcPr>
             <w:tcW w:w="3200" w:type="dxa"/>
@@ -1966,12 +1847,6 @@
         </w:tc>
       </w:tr>
       <w:tr>
-        <w:tblPrEx>
-          <w:tblCellMar>
-            <w:top w:w="0" w:type="dxa"/>
-            <w:bottom w:w="0" w:type="dxa"/>
-          </w:tblCellMar>
-        </w:tblPrEx>
         <w:tc>
           <w:tcPr>
             <w:tcW w:w="3200" w:type="dxa"/>
@@ -1994,7 +1869,6 @@
                 <w:sz w:val="19"/>
                 <w:szCs w:val="19"/>
               </w:rPr>
-              <w:lastRenderedPageBreak/>
               <w:t>Session Token + XSRF / Anti-CSRF Double-Submit</w:t>
             </w:r>
           </w:p>
@@ -2036,6 +1910,7 @@
                 <w:sz w:val="19"/>
                 <w:szCs w:val="19"/>
               </w:rPr>
+              <w:lastRenderedPageBreak/>
               <w:t>☐  No</w:t>
             </w:r>
           </w:p>
@@ -2062,18 +1937,13 @@
                 <w:sz w:val="19"/>
                 <w:szCs w:val="19"/>
               </w:rPr>
+              <w:lastRenderedPageBreak/>
               <w:t>Two-step login: POST credentials → GET XSRF token → send both on every call</w:t>
             </w:r>
           </w:p>
         </w:tc>
       </w:tr>
       <w:tr>
-        <w:tblPrEx>
-          <w:tblCellMar>
-            <w:top w:w="0" w:type="dxa"/>
-            <w:bottom w:w="0" w:type="dxa"/>
-          </w:tblCellMar>
-        </w:tblPrEx>
         <w:tc>
           <w:tcPr>
             <w:tcW w:w="3200" w:type="dxa"/>
@@ -2169,12 +2039,6 @@
         </w:tc>
       </w:tr>
       <w:tr>
-        <w:tblPrEx>
-          <w:tblCellMar>
-            <w:top w:w="0" w:type="dxa"/>
-            <w:bottom w:w="0" w:type="dxa"/>
-          </w:tblCellMar>
-        </w:tblPrEx>
         <w:tc>
           <w:tcPr>
             <w:tcW w:w="3200" w:type="dxa"/>
@@ -2270,12 +2134,6 @@
         </w:tc>
       </w:tr>
       <w:tr>
-        <w:tblPrEx>
-          <w:tblCellMar>
-            <w:top w:w="0" w:type="dxa"/>
-            <w:bottom w:w="0" w:type="dxa"/>
-          </w:tblCellMar>
-        </w:tblPrEx>
         <w:tc>
           <w:tcPr>
             <w:tcW w:w="3200" w:type="dxa"/>
@@ -2371,12 +2229,6 @@
         </w:tc>
       </w:tr>
       <w:tr>
-        <w:tblPrEx>
-          <w:tblCellMar>
-            <w:top w:w="0" w:type="dxa"/>
-            <w:bottom w:w="0" w:type="dxa"/>
-          </w:tblCellMar>
-        </w:tblPrEx>
         <w:tc>
           <w:tcPr>
             <w:tcW w:w="3200" w:type="dxa"/>
@@ -2472,12 +2324,6 @@
         </w:tc>
       </w:tr>
       <w:tr>
-        <w:tblPrEx>
-          <w:tblCellMar>
-            <w:top w:w="0" w:type="dxa"/>
-            <w:bottom w:w="0" w:type="dxa"/>
-          </w:tblCellMar>
-        </w:tblPrEx>
         <w:tc>
           <w:tcPr>
             <w:tcW w:w="3200" w:type="dxa"/>
@@ -2573,12 +2419,6 @@
         </w:tc>
       </w:tr>
       <w:tr>
-        <w:tblPrEx>
-          <w:tblCellMar>
-            <w:top w:w="0" w:type="dxa"/>
-            <w:bottom w:w="0" w:type="dxa"/>
-          </w:tblCellMar>
-        </w:tblPrEx>
         <w:tc>
           <w:tcPr>
             <w:tcW w:w="3200" w:type="dxa"/>
@@ -2674,12 +2514,6 @@
         </w:tc>
       </w:tr>
       <w:tr>
-        <w:tblPrEx>
-          <w:tblCellMar>
-            <w:top w:w="0" w:type="dxa"/>
-            <w:bottom w:w="0" w:type="dxa"/>
-          </w:tblCellMar>
-        </w:tblPrEx>
         <w:tc>
           <w:tcPr>
             <w:tcW w:w="3200" w:type="dxa"/>
@@ -2775,11 +2609,6 @@
         </w:tc>
       </w:tr>
     </w:tbl>
-    <w:p>
-      <w:pPr>
-        <w:spacing w:after="160"/>
-      </w:pPr>
-    </w:p>
     <w:p>
       <w:pPr>
         <w:pStyle w:val="Heading2"/>
@@ -2819,12 +2648,6 @@
         <w:gridCol w:w="6560"/>
       </w:tblGrid>
       <w:tr>
-        <w:tblPrEx>
-          <w:tblCellMar>
-            <w:top w:w="0" w:type="dxa"/>
-            <w:bottom w:w="0" w:type="dxa"/>
-          </w:tblCellMar>
-        </w:tblPrEx>
         <w:tc>
           <w:tcPr>
             <w:tcW w:w="2800" w:type="dxa"/>
@@ -2886,12 +2709,6 @@
         </w:tc>
       </w:tr>
       <w:tr>
-        <w:tblPrEx>
-          <w:tblCellMar>
-            <w:top w:w="0" w:type="dxa"/>
-            <w:bottom w:w="0" w:type="dxa"/>
-          </w:tblCellMar>
-        </w:tblPrEx>
         <w:tc>
           <w:tcPr>
             <w:tcW w:w="2800" w:type="dxa"/>
@@ -2953,12 +2770,6 @@
         </w:tc>
       </w:tr>
       <w:tr>
-        <w:tblPrEx>
-          <w:tblCellMar>
-            <w:top w:w="0" w:type="dxa"/>
-            <w:bottom w:w="0" w:type="dxa"/>
-          </w:tblCellMar>
-        </w:tblPrEx>
         <w:tc>
           <w:tcPr>
             <w:tcW w:w="2800" w:type="dxa"/>
@@ -3020,12 +2831,6 @@
         </w:tc>
       </w:tr>
       <w:tr>
-        <w:tblPrEx>
-          <w:tblCellMar>
-            <w:top w:w="0" w:type="dxa"/>
-            <w:bottom w:w="0" w:type="dxa"/>
-          </w:tblCellMar>
-        </w:tblPrEx>
         <w:tc>
           <w:tcPr>
             <w:tcW w:w="2800" w:type="dxa"/>
@@ -3087,12 +2892,6 @@
         </w:tc>
       </w:tr>
       <w:tr>
-        <w:tblPrEx>
-          <w:tblCellMar>
-            <w:top w:w="0" w:type="dxa"/>
-            <w:bottom w:w="0" w:type="dxa"/>
-          </w:tblCellMar>
-        </w:tblPrEx>
         <w:tc>
           <w:tcPr>
             <w:tcW w:w="2800" w:type="dxa"/>
@@ -3154,12 +2953,6 @@
         </w:tc>
       </w:tr>
       <w:tr>
-        <w:tblPrEx>
-          <w:tblCellMar>
-            <w:top w:w="0" w:type="dxa"/>
-            <w:bottom w:w="0" w:type="dxa"/>
-          </w:tblCellMar>
-        </w:tblPrEx>
         <w:tc>
           <w:tcPr>
             <w:tcW w:w="2800" w:type="dxa"/>
@@ -3221,12 +3014,6 @@
         </w:tc>
       </w:tr>
       <w:tr>
-        <w:tblPrEx>
-          <w:tblCellMar>
-            <w:top w:w="0" w:type="dxa"/>
-            <w:bottom w:w="0" w:type="dxa"/>
-          </w:tblCellMar>
-        </w:tblPrEx>
         <w:tc>
           <w:tcPr>
             <w:tcW w:w="2800" w:type="dxa"/>
@@ -3288,12 +3075,6 @@
         </w:tc>
       </w:tr>
       <w:tr>
-        <w:tblPrEx>
-          <w:tblCellMar>
-            <w:top w:w="0" w:type="dxa"/>
-            <w:bottom w:w="0" w:type="dxa"/>
-          </w:tblCellMar>
-        </w:tblPrEx>
         <w:tc>
           <w:tcPr>
             <w:tcW w:w="2800" w:type="dxa"/>
@@ -3355,12 +3136,6 @@
         </w:tc>
       </w:tr>
       <w:tr>
-        <w:tblPrEx>
-          <w:tblCellMar>
-            <w:top w:w="0" w:type="dxa"/>
-            <w:bottom w:w="0" w:type="dxa"/>
-          </w:tblCellMar>
-        </w:tblPrEx>
         <w:tc>
           <w:tcPr>
             <w:tcW w:w="2800" w:type="dxa"/>
@@ -3422,12 +3197,6 @@
         </w:tc>
       </w:tr>
       <w:tr>
-        <w:tblPrEx>
-          <w:tblCellMar>
-            <w:top w:w="0" w:type="dxa"/>
-            <w:bottom w:w="0" w:type="dxa"/>
-          </w:tblCellMar>
-        </w:tblPrEx>
         <w:tc>
           <w:tcPr>
             <w:tcW w:w="2800" w:type="dxa"/>
@@ -3489,12 +3258,6 @@
         </w:tc>
       </w:tr>
       <w:tr>
-        <w:tblPrEx>
-          <w:tblCellMar>
-            <w:top w:w="0" w:type="dxa"/>
-            <w:bottom w:w="0" w:type="dxa"/>
-          </w:tblCellMar>
-        </w:tblPrEx>
         <w:tc>
           <w:tcPr>
             <w:tcW w:w="2800" w:type="dxa"/>
@@ -3568,7 +3331,6 @@
           <w:szCs w:val="22"/>
           <w:shd w:val="clear" w:color="auto" w:fill="2E75B6"/>
         </w:rPr>
-        <w:lastRenderedPageBreak/>
         <w:t xml:space="preserve">  3  </w:t>
       </w:r>
       <w:r>
@@ -3581,15 +3343,11 @@
     </w:p>
     <w:p>
       <w:pPr>
-        <w:spacing w:after="60"/>
-      </w:pPr>
-    </w:p>
-    <w:p>
-      <w:pPr>
         <w:pStyle w:val="Heading2"/>
         <w:spacing w:after="120"/>
       </w:pPr>
       <w:r>
+        <w:lastRenderedPageBreak/>
         <w:t>3.1  Management Hierarchy</w:t>
       </w:r>
     </w:p>
@@ -3624,12 +3382,6 @@
         <w:gridCol w:w="3160"/>
       </w:tblGrid>
       <w:tr>
-        <w:tblPrEx>
-          <w:tblCellMar>
-            <w:top w:w="0" w:type="dxa"/>
-            <w:bottom w:w="0" w:type="dxa"/>
-          </w:tblCellMar>
-        </w:tblPrEx>
         <w:trPr>
           <w:tblHeader/>
         </w:trPr>
@@ -3725,12 +3477,6 @@
         </w:tc>
       </w:tr>
       <w:tr>
-        <w:tblPrEx>
-          <w:tblCellMar>
-            <w:top w:w="0" w:type="dxa"/>
-            <w:bottom w:w="0" w:type="dxa"/>
-          </w:tblCellMar>
-        </w:tblPrEx>
         <w:tc>
           <w:tcPr>
             <w:tcW w:w="2200" w:type="dxa"/>
@@ -3803,12 +3549,6 @@
         </w:tc>
       </w:tr>
       <w:tr>
-        <w:tblPrEx>
-          <w:tblCellMar>
-            <w:top w:w="0" w:type="dxa"/>
-            <w:bottom w:w="0" w:type="dxa"/>
-          </w:tblCellMar>
-        </w:tblPrEx>
         <w:tc>
           <w:tcPr>
             <w:tcW w:w="2200" w:type="dxa"/>
@@ -3881,12 +3621,6 @@
         </w:tc>
       </w:tr>
       <w:tr>
-        <w:tblPrEx>
-          <w:tblCellMar>
-            <w:top w:w="0" w:type="dxa"/>
-            <w:bottom w:w="0" w:type="dxa"/>
-          </w:tblCellMar>
-        </w:tblPrEx>
         <w:tc>
           <w:tcPr>
             <w:tcW w:w="2200" w:type="dxa"/>
@@ -3959,12 +3693,6 @@
         </w:tc>
       </w:tr>
       <w:tr>
-        <w:tblPrEx>
-          <w:tblCellMar>
-            <w:top w:w="0" w:type="dxa"/>
-            <w:bottom w:w="0" w:type="dxa"/>
-          </w:tblCellMar>
-        </w:tblPrEx>
         <w:tc>
           <w:tcPr>
             <w:tcW w:w="2200" w:type="dxa"/>
@@ -4064,12 +3792,6 @@
         <w:gridCol w:w="6560"/>
       </w:tblGrid>
       <w:tr>
-        <w:tblPrEx>
-          <w:tblCellMar>
-            <w:top w:w="0" w:type="dxa"/>
-            <w:bottom w:w="0" w:type="dxa"/>
-          </w:tblCellMar>
-        </w:tblPrEx>
         <w:tc>
           <w:tcPr>
             <w:tcW w:w="2800" w:type="dxa"/>
@@ -4131,12 +3853,6 @@
         </w:tc>
       </w:tr>
       <w:tr>
-        <w:tblPrEx>
-          <w:tblCellMar>
-            <w:top w:w="0" w:type="dxa"/>
-            <w:bottom w:w="0" w:type="dxa"/>
-          </w:tblCellMar>
-        </w:tblPrEx>
         <w:tc>
           <w:tcPr>
             <w:tcW w:w="2800" w:type="dxa"/>
@@ -4219,11 +3935,6 @@
       <w:r>
         <w:t>List every device or node type that will appear in the API Discovery. For each type, also provide the API endpoint used to list all devices of that type and attach a sample response. This replaces a separate device-list endpoint table in Section 4.</w:t>
       </w:r>
-    </w:p>
-    <w:p>
-      <w:pPr>
-        <w:spacing w:after="80"/>
-      </w:pPr>
     </w:p>
     <w:tbl>
       <w:tblPr>
@@ -4251,12 +3962,6 @@
         <w:gridCol w:w="1400"/>
       </w:tblGrid>
       <w:tr>
-        <w:tblPrEx>
-          <w:tblCellMar>
-            <w:top w:w="0" w:type="dxa"/>
-            <w:bottom w:w="0" w:type="dxa"/>
-          </w:tblCellMar>
-        </w:tblPrEx>
         <w:trPr>
           <w:tblHeader/>
         </w:trPr>
@@ -4368,7 +4073,6 @@
             </w:tcMar>
           </w:tcPr>
           <w:p>
-            <w:proofErr w:type="spellStart"/>
             <w:r>
               <w:rPr>
                 <w:b/>
@@ -4377,9 +4081,28 @@
                 <w:sz w:val="19"/>
                 <w:szCs w:val="19"/>
               </w:rPr>
-              <w:t>Mgmt</w:t>
-            </w:r>
-            <w:proofErr w:type="spellEnd"/>
+              <w:t>Mgmt IP Field</w:t>
+            </w:r>
+          </w:p>
+        </w:tc>
+        <w:tc>
+          <w:tcPr>
+            <w:tcW w:w="1800" w:type="dxa"/>
+            <w:tcBorders>
+              <w:top w:val="single" w:sz="4" w:space="0" w:color="BBBBBB"/>
+              <w:left w:val="single" w:sz="4" w:space="0" w:color="BBBBBB"/>
+              <w:bottom w:val="single" w:sz="4" w:space="0" w:color="BBBBBB"/>
+              <w:right w:val="single" w:sz="4" w:space="0" w:color="BBBBBB"/>
+            </w:tcBorders>
+            <w:shd w:val="clear" w:color="auto" w:fill="2E75B6"/>
+            <w:tcMar>
+              <w:top w:w="100" w:type="dxa"/>
+              <w:left w:w="140" w:type="dxa"/>
+              <w:bottom w:w="100" w:type="dxa"/>
+              <w:right w:w="140" w:type="dxa"/>
+            </w:tcMar>
+          </w:tcPr>
+          <w:p>
             <w:r>
               <w:rPr>
                 <w:b/>
@@ -4388,20 +4111,20 @@
                 <w:sz w:val="19"/>
                 <w:szCs w:val="19"/>
               </w:rPr>
-              <w:t xml:space="preserve"> IP Field</w:t>
-            </w:r>
-          </w:p>
-        </w:tc>
-        <w:tc>
-          <w:tcPr>
-            <w:tcW w:w="1800" w:type="dxa"/>
-            <w:tcBorders>
-              <w:top w:val="single" w:sz="4" w:space="0" w:color="BBBBBB"/>
-              <w:left w:val="single" w:sz="4" w:space="0" w:color="BBBBBB"/>
-              <w:bottom w:val="single" w:sz="4" w:space="0" w:color="BBBBBB"/>
-              <w:right w:val="single" w:sz="4" w:space="0" w:color="BBBBBB"/>
-            </w:tcBorders>
-            <w:shd w:val="clear" w:color="auto" w:fill="2E75B6"/>
+              <w:t>List-All API Endpoint</w:t>
+            </w:r>
+          </w:p>
+        </w:tc>
+        <w:tc>
+          <w:tcPr>
+            <w:tcW w:w="1400" w:type="dxa"/>
+            <w:tcBorders>
+              <w:top w:val="single" w:sz="4" w:space="0" w:color="BBBBBB"/>
+              <w:left w:val="single" w:sz="4" w:space="0" w:color="BBBBBB"/>
+              <w:bottom w:val="single" w:sz="4" w:space="0" w:color="BBBBBB"/>
+              <w:right w:val="single" w:sz="4" w:space="0" w:color="BBBBBB"/>
+            </w:tcBorders>
+            <w:shd w:val="clear" w:color="auto" w:fill="C55A11"/>
             <w:tcMar>
               <w:top w:w="100" w:type="dxa"/>
               <w:left w:w="140" w:type="dxa"/>
@@ -4418,48 +4141,12 @@
                 <w:sz w:val="19"/>
                 <w:szCs w:val="19"/>
               </w:rPr>
-              <w:t>List-All API Endpoint</w:t>
-            </w:r>
-          </w:p>
-        </w:tc>
-        <w:tc>
-          <w:tcPr>
-            <w:tcW w:w="1400" w:type="dxa"/>
-            <w:tcBorders>
-              <w:top w:val="single" w:sz="4" w:space="0" w:color="BBBBBB"/>
-              <w:left w:val="single" w:sz="4" w:space="0" w:color="BBBBBB"/>
-              <w:bottom w:val="single" w:sz="4" w:space="0" w:color="BBBBBB"/>
-              <w:right w:val="single" w:sz="4" w:space="0" w:color="BBBBBB"/>
-            </w:tcBorders>
-            <w:shd w:val="clear" w:color="auto" w:fill="C55A11"/>
-            <w:tcMar>
-              <w:top w:w="100" w:type="dxa"/>
-              <w:left w:w="140" w:type="dxa"/>
-              <w:bottom w:w="100" w:type="dxa"/>
-              <w:right w:w="140" w:type="dxa"/>
-            </w:tcMar>
-          </w:tcPr>
-          <w:p>
-            <w:r>
-              <w:rPr>
-                <w:b/>
-                <w:bCs/>
-                <w:color w:val="FFFFFF"/>
-                <w:sz w:val="19"/>
-                <w:szCs w:val="19"/>
-              </w:rPr>
               <w:t>Sample Response</w:t>
             </w:r>
           </w:p>
         </w:tc>
       </w:tr>
       <w:tr>
-        <w:tblPrEx>
-          <w:tblCellMar>
-            <w:top w:w="0" w:type="dxa"/>
-            <w:bottom w:w="0" w:type="dxa"/>
-          </w:tblCellMar>
-        </w:tblPrEx>
         <w:tc>
           <w:tcPr>
             <w:tcW w:w="1700" w:type="dxa"/>
@@ -4582,12 +4269,6 @@
         </w:tc>
       </w:tr>
       <w:tr>
-        <w:tblPrEx>
-          <w:tblCellMar>
-            <w:top w:w="0" w:type="dxa"/>
-            <w:bottom w:w="0" w:type="dxa"/>
-          </w:tblCellMar>
-        </w:tblPrEx>
         <w:tc>
           <w:tcPr>
             <w:tcW w:w="1700" w:type="dxa"/>
@@ -4710,12 +4391,6 @@
         </w:tc>
       </w:tr>
       <w:tr>
-        <w:tblPrEx>
-          <w:tblCellMar>
-            <w:top w:w="0" w:type="dxa"/>
-            <w:bottom w:w="0" w:type="dxa"/>
-          </w:tblCellMar>
-        </w:tblPrEx>
         <w:tc>
           <w:tcPr>
             <w:tcW w:w="1700" w:type="dxa"/>
@@ -4838,12 +4513,6 @@
         </w:tc>
       </w:tr>
       <w:tr>
-        <w:tblPrEx>
-          <w:tblCellMar>
-            <w:top w:w="0" w:type="dxa"/>
-            <w:bottom w:w="0" w:type="dxa"/>
-          </w:tblCellMar>
-        </w:tblPrEx>
         <w:tc>
           <w:tcPr>
             <w:tcW w:w="1700" w:type="dxa"/>
@@ -4966,12 +4635,6 @@
         </w:tc>
       </w:tr>
       <w:tr>
-        <w:tblPrEx>
-          <w:tblCellMar>
-            <w:top w:w="0" w:type="dxa"/>
-            <w:bottom w:w="0" w:type="dxa"/>
-          </w:tblCellMar>
-        </w:tblPrEx>
         <w:tc>
           <w:tcPr>
             <w:tcW w:w="1700" w:type="dxa"/>
@@ -5105,7 +4768,6 @@
         <w:spacing w:after="120"/>
       </w:pPr>
       <w:r>
-        <w:lastRenderedPageBreak/>
         <w:t>3.3  Virtual Partitions (Multi-tenancy within a Device)</w:t>
       </w:r>
     </w:p>
@@ -5144,12 +4806,6 @@
         <w:gridCol w:w="6560"/>
       </w:tblGrid>
       <w:tr>
-        <w:tblPrEx>
-          <w:tblCellMar>
-            <w:top w:w="0" w:type="dxa"/>
-            <w:bottom w:w="0" w:type="dxa"/>
-          </w:tblCellMar>
-        </w:tblPrEx>
         <w:tc>
           <w:tcPr>
             <w:tcW w:w="2800" w:type="dxa"/>
@@ -5176,6 +4832,7 @@
                 <w:sz w:val="19"/>
                 <w:szCs w:val="19"/>
               </w:rPr>
+              <w:lastRenderedPageBreak/>
               <w:t>Virtual Partitions Supported?</w:t>
             </w:r>
           </w:p>
@@ -5223,12 +4880,6 @@
         </w:tc>
       </w:tr>
       <w:tr>
-        <w:tblPrEx>
-          <w:tblCellMar>
-            <w:top w:w="0" w:type="dxa"/>
-            <w:bottom w:w="0" w:type="dxa"/>
-          </w:tblCellMar>
-        </w:tblPrEx>
         <w:tc>
           <w:tcPr>
             <w:tcW w:w="2800" w:type="dxa"/>
@@ -5290,12 +4941,6 @@
         </w:tc>
       </w:tr>
       <w:tr>
-        <w:tblPrEx>
-          <w:tblCellMar>
-            <w:top w:w="0" w:type="dxa"/>
-            <w:bottom w:w="0" w:type="dxa"/>
-          </w:tblCellMar>
-        </w:tblPrEx>
         <w:tc>
           <w:tcPr>
             <w:tcW w:w="2800" w:type="dxa"/>
@@ -5369,12 +5014,6 @@
         </w:tc>
       </w:tr>
       <w:tr>
-        <w:tblPrEx>
-          <w:tblCellMar>
-            <w:top w:w="0" w:type="dxa"/>
-            <w:bottom w:w="0" w:type="dxa"/>
-          </w:tblCellMar>
-        </w:tblPrEx>
         <w:tc>
           <w:tcPr>
             <w:tcW w:w="2800" w:type="dxa"/>
@@ -5448,11 +5087,6 @@
         </w:tc>
       </w:tr>
     </w:tbl>
-    <w:p>
-      <w:pPr>
-        <w:spacing w:after="200"/>
-      </w:pPr>
-    </w:p>
     <w:p>
       <w:pPr>
         <w:pStyle w:val="Heading1"/>
@@ -5503,33 +5137,8 @@
           <w:sz w:val="18"/>
           <w:szCs w:val="18"/>
         </w:rPr>
-        <w:t xml:space="preserve">The orange Sample Response column appears in every endpoint table. Paste a representative JSON / XML </w:t>
+        <w:t>The orange Sample Response column appears in every endpoint table. Paste a representative JSON / XML snippet, or write 'see attached file' and attach the file.</w:t>
       </w:r>
-      <w:proofErr w:type="gramStart"/>
-      <w:r>
-        <w:rPr>
-          <w:i/>
-          <w:iCs/>
-          <w:sz w:val="18"/>
-          <w:szCs w:val="18"/>
-        </w:rPr>
-        <w:t>snippet, or</w:t>
-      </w:r>
-      <w:proofErr w:type="gramEnd"/>
-      <w:r>
-        <w:rPr>
-          <w:i/>
-          <w:iCs/>
-          <w:sz w:val="18"/>
-          <w:szCs w:val="18"/>
-        </w:rPr>
-        <w:t xml:space="preserve"> write 'see attached file' and attach the file.</w:t>
-      </w:r>
-    </w:p>
-    <w:p>
-      <w:pPr>
-        <w:spacing w:after="100"/>
-      </w:pPr>
     </w:p>
     <w:p>
       <w:pPr>
@@ -5565,12 +5174,6 @@
         <w:gridCol w:w="2086"/>
       </w:tblGrid>
       <w:tr>
-        <w:tblPrEx>
-          <w:tblCellMar>
-            <w:top w:w="0" w:type="dxa"/>
-            <w:bottom w:w="0" w:type="dxa"/>
-          </w:tblCellMar>
-        </w:tblPrEx>
         <w:trPr>
           <w:tblHeader/>
         </w:trPr>
@@ -5726,12 +5329,6 @@
         </w:tc>
       </w:tr>
       <w:tr>
-        <w:tblPrEx>
-          <w:tblCellMar>
-            <w:top w:w="0" w:type="dxa"/>
-            <w:bottom w:w="0" w:type="dxa"/>
-          </w:tblCellMar>
-        </w:tblPrEx>
         <w:tc>
           <w:tcPr>
             <w:tcW w:w="2100" w:type="dxa"/>
@@ -5866,12 +5463,6 @@
         </w:tc>
       </w:tr>
       <w:tr>
-        <w:tblPrEx>
-          <w:tblCellMar>
-            <w:top w:w="0" w:type="dxa"/>
-            <w:bottom w:w="0" w:type="dxa"/>
-          </w:tblCellMar>
-        </w:tblPrEx>
         <w:tc>
           <w:tcPr>
             <w:tcW w:w="2100" w:type="dxa"/>
@@ -6006,12 +5597,6 @@
         </w:tc>
       </w:tr>
       <w:tr>
-        <w:tblPrEx>
-          <w:tblCellMar>
-            <w:top w:w="0" w:type="dxa"/>
-            <w:bottom w:w="0" w:type="dxa"/>
-          </w:tblCellMar>
-        </w:tblPrEx>
         <w:tc>
           <w:tcPr>
             <w:tcW w:w="2100" w:type="dxa"/>
@@ -6146,12 +5731,6 @@
         </w:tc>
       </w:tr>
       <w:tr>
-        <w:tblPrEx>
-          <w:tblCellMar>
-            <w:top w:w="0" w:type="dxa"/>
-            <w:bottom w:w="0" w:type="dxa"/>
-          </w:tblCellMar>
-        </w:tblPrEx>
         <w:tc>
           <w:tcPr>
             <w:tcW w:w="2100" w:type="dxa"/>
@@ -6286,12 +5865,6 @@
         </w:tc>
       </w:tr>
       <w:tr>
-        <w:tblPrEx>
-          <w:tblCellMar>
-            <w:top w:w="0" w:type="dxa"/>
-            <w:bottom w:w="0" w:type="dxa"/>
-          </w:tblCellMar>
-        </w:tblPrEx>
         <w:tc>
           <w:tcPr>
             <w:tcW w:w="2100" w:type="dxa"/>
@@ -6447,11 +6020,6 @@
       <w:r>
         <w:t>The 'List All Devices' endpoint for each device type is captured in Section 3.2. Provide the remaining device-level endpoints here.</w:t>
       </w:r>
-    </w:p>
-    <w:p>
-      <w:pPr>
-        <w:spacing w:after="80"/>
-      </w:pPr>
     </w:p>
     <w:tbl>
       <w:tblPr>
@@ -6478,12 +6046,6 @@
         <w:gridCol w:w="2200"/>
       </w:tblGrid>
       <w:tr>
-        <w:tblPrEx>
-          <w:tblCellMar>
-            <w:top w:w="0" w:type="dxa"/>
-            <w:bottom w:w="0" w:type="dxa"/>
-          </w:tblCellMar>
-        </w:tblPrEx>
         <w:trPr>
           <w:tblHeader/>
         </w:trPr>
@@ -6513,7 +6075,6 @@
                 <w:sz w:val="19"/>
                 <w:szCs w:val="19"/>
               </w:rPr>
-              <w:lastRenderedPageBreak/>
               <w:t>Purpose</w:t>
             </w:r>
           </w:p>
@@ -6640,12 +6201,6 @@
         </w:tc>
       </w:tr>
       <w:tr>
-        <w:tblPrEx>
-          <w:tblCellMar>
-            <w:top w:w="0" w:type="dxa"/>
-            <w:bottom w:w="0" w:type="dxa"/>
-          </w:tblCellMar>
-        </w:tblPrEx>
         <w:tc>
           <w:tcPr>
             <w:tcW w:w="2100" w:type="dxa"/>
@@ -6780,12 +6335,6 @@
         </w:tc>
       </w:tr>
       <w:tr>
-        <w:tblPrEx>
-          <w:tblCellMar>
-            <w:top w:w="0" w:type="dxa"/>
-            <w:bottom w:w="0" w:type="dxa"/>
-          </w:tblCellMar>
-        </w:tblPrEx>
         <w:tc>
           <w:tcPr>
             <w:tcW w:w="2100" w:type="dxa"/>
@@ -6808,6 +6357,7 @@
                 <w:sz w:val="19"/>
                 <w:szCs w:val="19"/>
               </w:rPr>
+              <w:lastRenderedPageBreak/>
               <w:t>List Devices by Scope Filter</w:t>
             </w:r>
           </w:p>
@@ -6920,12 +6470,6 @@
         </w:tc>
       </w:tr>
       <w:tr>
-        <w:tblPrEx>
-          <w:tblCellMar>
-            <w:top w:w="0" w:type="dxa"/>
-            <w:bottom w:w="0" w:type="dxa"/>
-          </w:tblCellMar>
-        </w:tblPrEx>
         <w:tc>
           <w:tcPr>
             <w:tcW w:w="2100" w:type="dxa"/>
@@ -7060,12 +6604,6 @@
         </w:tc>
       </w:tr>
       <w:tr>
-        <w:tblPrEx>
-          <w:tblCellMar>
-            <w:top w:w="0" w:type="dxa"/>
-            <w:bottom w:w="0" w:type="dxa"/>
-          </w:tblCellMar>
-        </w:tblPrEx>
         <w:tc>
           <w:tcPr>
             <w:tcW w:w="2100" w:type="dxa"/>
@@ -7239,12 +6777,6 @@
         <w:gridCol w:w="2198"/>
       </w:tblGrid>
       <w:tr>
-        <w:tblPrEx>
-          <w:tblCellMar>
-            <w:top w:w="0" w:type="dxa"/>
-            <w:bottom w:w="0" w:type="dxa"/>
-          </w:tblCellMar>
-        </w:tblPrEx>
         <w:trPr>
           <w:tblHeader/>
         </w:trPr>
@@ -7400,12 +6932,6 @@
         </w:tc>
       </w:tr>
       <w:tr>
-        <w:tblPrEx>
-          <w:tblCellMar>
-            <w:top w:w="0" w:type="dxa"/>
-            <w:bottom w:w="0" w:type="dxa"/>
-          </w:tblCellMar>
-        </w:tblPrEx>
         <w:tc>
           <w:tcPr>
             <w:tcW w:w="2100" w:type="dxa"/>
@@ -7540,12 +7066,6 @@
         </w:tc>
       </w:tr>
       <w:tr>
-        <w:tblPrEx>
-          <w:tblCellMar>
-            <w:top w:w="0" w:type="dxa"/>
-            <w:bottom w:w="0" w:type="dxa"/>
-          </w:tblCellMar>
-        </w:tblPrEx>
         <w:tc>
           <w:tcPr>
             <w:tcW w:w="2100" w:type="dxa"/>
@@ -7680,12 +7200,6 @@
         </w:tc>
       </w:tr>
       <w:tr>
-        <w:tblPrEx>
-          <w:tblCellMar>
-            <w:top w:w="0" w:type="dxa"/>
-            <w:bottom w:w="0" w:type="dxa"/>
-          </w:tblCellMar>
-        </w:tblPrEx>
         <w:tc>
           <w:tcPr>
             <w:tcW w:w="2100" w:type="dxa"/>
@@ -7820,12 +7334,6 @@
         </w:tc>
       </w:tr>
       <w:tr>
-        <w:tblPrEx>
-          <w:tblCellMar>
-            <w:top w:w="0" w:type="dxa"/>
-            <w:bottom w:w="0" w:type="dxa"/>
-          </w:tblCellMar>
-        </w:tblPrEx>
         <w:tc>
           <w:tcPr>
             <w:tcW w:w="2100" w:type="dxa"/>
@@ -7960,12 +7468,6 @@
         </w:tc>
       </w:tr>
       <w:tr>
-        <w:tblPrEx>
-          <w:tblCellMar>
-            <w:top w:w="0" w:type="dxa"/>
-            <w:bottom w:w="0" w:type="dxa"/>
-          </w:tblCellMar>
-        </w:tblPrEx>
         <w:tc>
           <w:tcPr>
             <w:tcW w:w="2100" w:type="dxa"/>
@@ -8064,29 +7566,7 @@
                 <w:sz w:val="17"/>
                 <w:szCs w:val="17"/>
               </w:rPr>
-              <w:t>e.g. ?</w:t>
-            </w:r>
-            <w:proofErr w:type="spellStart"/>
-            <w:r>
-              <w:rPr>
-                <w:i/>
-                <w:iCs/>
-                <w:color w:val="999999"/>
-                <w:sz w:val="17"/>
-                <w:szCs w:val="17"/>
-              </w:rPr>
-              <w:t>vdom</w:t>
-            </w:r>
-            <w:proofErr w:type="spellEnd"/>
-            <w:r>
-              <w:rPr>
-                <w:i/>
-                <w:iCs/>
-                <w:color w:val="999999"/>
-                <w:sz w:val="17"/>
-                <w:szCs w:val="17"/>
-              </w:rPr>
-              <w:t>=root  /  /namespaces/{ns}/pods</w:t>
+              <w:t>e.g. ?vdom=root  /  /namespaces/{ns}/pods</w:t>
             </w:r>
           </w:p>
         </w:tc>
@@ -8122,12 +7602,6 @@
         </w:tc>
       </w:tr>
       <w:tr>
-        <w:tblPrEx>
-          <w:tblCellMar>
-            <w:top w:w="0" w:type="dxa"/>
-            <w:bottom w:w="0" w:type="dxa"/>
-          </w:tblCellMar>
-        </w:tblPrEx>
         <w:tc>
           <w:tcPr>
             <w:tcW w:w="2100" w:type="dxa"/>
@@ -8301,12 +7775,6 @@
         <w:gridCol w:w="2200"/>
       </w:tblGrid>
       <w:tr>
-        <w:tblPrEx>
-          <w:tblCellMar>
-            <w:top w:w="0" w:type="dxa"/>
-            <w:bottom w:w="0" w:type="dxa"/>
-          </w:tblCellMar>
-        </w:tblPrEx>
         <w:trPr>
           <w:tblHeader/>
         </w:trPr>
@@ -8462,12 +7930,6 @@
         </w:tc>
       </w:tr>
       <w:tr>
-        <w:tblPrEx>
-          <w:tblCellMar>
-            <w:top w:w="0" w:type="dxa"/>
-            <w:bottom w:w="0" w:type="dxa"/>
-          </w:tblCellMar>
-        </w:tblPrEx>
         <w:tc>
           <w:tcPr>
             <w:tcW w:w="2100" w:type="dxa"/>
@@ -8602,12 +8064,6 @@
         </w:tc>
       </w:tr>
       <w:tr>
-        <w:tblPrEx>
-          <w:tblCellMar>
-            <w:top w:w="0" w:type="dxa"/>
-            <w:bottom w:w="0" w:type="dxa"/>
-          </w:tblCellMar>
-        </w:tblPrEx>
         <w:tc>
           <w:tcPr>
             <w:tcW w:w="2100" w:type="dxa"/>
@@ -8742,12 +8198,6 @@
         </w:tc>
       </w:tr>
       <w:tr>
-        <w:tblPrEx>
-          <w:tblCellMar>
-            <w:top w:w="0" w:type="dxa"/>
-            <w:bottom w:w="0" w:type="dxa"/>
-          </w:tblCellMar>
-        </w:tblPrEx>
         <w:tc>
           <w:tcPr>
             <w:tcW w:w="2100" w:type="dxa"/>
@@ -8882,12 +8332,6 @@
         </w:tc>
       </w:tr>
       <w:tr>
-        <w:tblPrEx>
-          <w:tblCellMar>
-            <w:top w:w="0" w:type="dxa"/>
-            <w:bottom w:w="0" w:type="dxa"/>
-          </w:tblCellMar>
-        </w:tblPrEx>
         <w:tc>
           <w:tcPr>
             <w:tcW w:w="2100" w:type="dxa"/>
@@ -9022,12 +8466,6 @@
         </w:tc>
       </w:tr>
       <w:tr>
-        <w:tblPrEx>
-          <w:tblCellMar>
-            <w:top w:w="0" w:type="dxa"/>
-            <w:bottom w:w="0" w:type="dxa"/>
-          </w:tblCellMar>
-        </w:tblPrEx>
         <w:tc>
           <w:tcPr>
             <w:tcW w:w="2100" w:type="dxa"/>
@@ -9050,7 +8488,6 @@
                 <w:sz w:val="19"/>
                 <w:szCs w:val="19"/>
               </w:rPr>
-              <w:lastRenderedPageBreak/>
               <w:t>Logical / Peering / Overlay Links</w:t>
             </w:r>
           </w:p>
@@ -9163,12 +8600,6 @@
         </w:tc>
       </w:tr>
       <w:tr>
-        <w:tblPrEx>
-          <w:tblCellMar>
-            <w:top w:w="0" w:type="dxa"/>
-            <w:bottom w:w="0" w:type="dxa"/>
-          </w:tblCellMar>
-        </w:tblPrEx>
         <w:tc>
           <w:tcPr>
             <w:tcW w:w="2100" w:type="dxa"/>
@@ -9191,6 +8622,7 @@
                 <w:sz w:val="19"/>
                 <w:szCs w:val="19"/>
               </w:rPr>
+              <w:lastRenderedPageBreak/>
               <w:t>Wireless AP ↔ Client Association</w:t>
             </w:r>
           </w:p>
@@ -9324,11 +8756,6 @@
       <w:r>
         <w:t>These five tables are mandatory for all API Discovery implementations. Provide the endpoint and a sample response for each.</w:t>
       </w:r>
-    </w:p>
-    <w:p>
-      <w:pPr>
-        <w:spacing w:after="80"/>
-      </w:pPr>
     </w:p>
     <w:tbl>
       <w:tblPr>
@@ -9354,12 +8781,6 @@
         <w:gridCol w:w="2300"/>
       </w:tblGrid>
       <w:tr>
-        <w:tblPrEx>
-          <w:tblCellMar>
-            <w:top w:w="0" w:type="dxa"/>
-            <w:bottom w:w="0" w:type="dxa"/>
-          </w:tblCellMar>
-        </w:tblPrEx>
         <w:trPr>
           <w:tblHeader/>
         </w:trPr>
@@ -9485,12 +8906,6 @@
         </w:tc>
       </w:tr>
       <w:tr>
-        <w:tblPrEx>
-          <w:tblCellMar>
-            <w:top w:w="0" w:type="dxa"/>
-            <w:bottom w:w="0" w:type="dxa"/>
-          </w:tblCellMar>
-        </w:tblPrEx>
         <w:tc>
           <w:tcPr>
             <w:tcW w:w="1700" w:type="dxa"/>
@@ -9596,12 +9011,6 @@
         </w:tc>
       </w:tr>
       <w:tr>
-        <w:tblPrEx>
-          <w:tblCellMar>
-            <w:top w:w="0" w:type="dxa"/>
-            <w:bottom w:w="0" w:type="dxa"/>
-          </w:tblCellMar>
-        </w:tblPrEx>
         <w:tc>
           <w:tcPr>
             <w:tcW w:w="1700" w:type="dxa"/>
@@ -9707,12 +9116,6 @@
         </w:tc>
       </w:tr>
       <w:tr>
-        <w:tblPrEx>
-          <w:tblCellMar>
-            <w:top w:w="0" w:type="dxa"/>
-            <w:bottom w:w="0" w:type="dxa"/>
-          </w:tblCellMar>
-        </w:tblPrEx>
         <w:tc>
           <w:tcPr>
             <w:tcW w:w="1700" w:type="dxa"/>
@@ -9818,12 +9221,6 @@
         </w:tc>
       </w:tr>
       <w:tr>
-        <w:tblPrEx>
-          <w:tblCellMar>
-            <w:top w:w="0" w:type="dxa"/>
-            <w:bottom w:w="0" w:type="dxa"/>
-          </w:tblCellMar>
-        </w:tblPrEx>
         <w:tc>
           <w:tcPr>
             <w:tcW w:w="1700" w:type="dxa"/>
@@ -9929,12 +9326,6 @@
         </w:tc>
       </w:tr>
       <w:tr>
-        <w:tblPrEx>
-          <w:tblCellMar>
-            <w:top w:w="0" w:type="dxa"/>
-            <w:bottom w:w="0" w:type="dxa"/>
-          </w:tblCellMar>
-        </w:tblPrEx>
         <w:tc>
           <w:tcPr>
             <w:tcW w:w="1700" w:type="dxa"/>
@@ -10064,11 +9455,6 @@
     </w:p>
     <w:p>
       <w:pPr>
-        <w:spacing w:after="80"/>
-      </w:pPr>
-    </w:p>
-    <w:p>
-      <w:pPr>
         <w:spacing w:before="60" w:after="60"/>
       </w:pPr>
       <w:r>
@@ -10079,11 +9465,6 @@
         </w:rPr>
         <w:t>Routing, Forwarding &amp; VPN</w:t>
       </w:r>
-    </w:p>
-    <w:p>
-      <w:pPr>
-        <w:spacing w:after="60"/>
-      </w:pPr>
     </w:p>
     <w:tbl>
       <w:tblPr>
@@ -10110,12 +9491,6 @@
         <w:gridCol w:w="1800"/>
       </w:tblGrid>
       <w:tr>
-        <w:tblPrEx>
-          <w:tblCellMar>
-            <w:top w:w="0" w:type="dxa"/>
-            <w:bottom w:w="0" w:type="dxa"/>
-          </w:tblCellMar>
-        </w:tblPrEx>
         <w:trPr>
           <w:tblHeader/>
         </w:trPr>
@@ -10271,12 +9646,6 @@
         </w:tc>
       </w:tr>
       <w:tr>
-        <w:tblPrEx>
-          <w:tblCellMar>
-            <w:top w:w="0" w:type="dxa"/>
-            <w:bottom w:w="0" w:type="dxa"/>
-          </w:tblCellMar>
-        </w:tblPrEx>
         <w:tc>
           <w:tcPr>
             <w:tcW w:w="2200" w:type="dxa"/>
@@ -10328,23 +9697,7 @@
                 <w:sz w:val="18"/>
                 <w:szCs w:val="18"/>
               </w:rPr>
-              <w:t xml:space="preserve">Routes </w:t>
-            </w:r>
-            <w:proofErr w:type="gramStart"/>
-            <w:r>
-              <w:rPr>
-                <w:sz w:val="18"/>
-                <w:szCs w:val="18"/>
-              </w:rPr>
-              <w:t>actually active</w:t>
-            </w:r>
-            <w:proofErr w:type="gramEnd"/>
-            <w:r>
-              <w:rPr>
-                <w:sz w:val="18"/>
-                <w:szCs w:val="18"/>
-              </w:rPr>
-              <w:t xml:space="preserve"> on the device — programmed, learned, injected</w:t>
+              <w:t>Routes actually active on the device — programmed, learned, injected</w:t>
             </w:r>
           </w:p>
         </w:tc>
@@ -10451,12 +9804,6 @@
         </w:tc>
       </w:tr>
       <w:tr>
-        <w:tblPrEx>
-          <w:tblCellMar>
-            <w:top w:w="0" w:type="dxa"/>
-            <w:bottom w:w="0" w:type="dxa"/>
-          </w:tblCellMar>
-        </w:tblPrEx>
         <w:tc>
           <w:tcPr>
             <w:tcW w:w="2200" w:type="dxa"/>
@@ -10615,12 +9962,6 @@
         </w:tc>
       </w:tr>
       <w:tr>
-        <w:tblPrEx>
-          <w:tblCellMar>
-            <w:top w:w="0" w:type="dxa"/>
-            <w:bottom w:w="0" w:type="dxa"/>
-          </w:tblCellMar>
-        </w:tblPrEx>
         <w:tc>
           <w:tcPr>
             <w:tcW w:w="2200" w:type="dxa"/>
@@ -10725,7 +10066,6 @@
                 <w:sz w:val="19"/>
                 <w:szCs w:val="19"/>
               </w:rPr>
-              <w:lastRenderedPageBreak/>
               <w:t>☐  N/A</w:t>
             </w:r>
           </w:p>
@@ -10780,12 +10120,6 @@
         </w:tc>
       </w:tr>
       <w:tr>
-        <w:tblPrEx>
-          <w:tblCellMar>
-            <w:top w:w="0" w:type="dxa"/>
-            <w:bottom w:w="0" w:type="dxa"/>
-          </w:tblCellMar>
-        </w:tblPrEx>
         <w:tc>
           <w:tcPr>
             <w:tcW w:w="2200" w:type="dxa"/>
@@ -10944,12 +10278,6 @@
         </w:tc>
       </w:tr>
       <w:tr>
-        <w:tblPrEx>
-          <w:tblCellMar>
-            <w:top w:w="0" w:type="dxa"/>
-            <w:bottom w:w="0" w:type="dxa"/>
-          </w:tblCellMar>
-        </w:tblPrEx>
         <w:tc>
           <w:tcPr>
             <w:tcW w:w="2200" w:type="dxa"/>
@@ -10975,6 +10303,7 @@
                 <w:sz w:val="19"/>
                 <w:szCs w:val="19"/>
               </w:rPr>
+              <w:lastRenderedPageBreak/>
               <w:t>IPsec / VPN Tunnel Table</w:t>
             </w:r>
           </w:p>
@@ -11108,12 +10437,6 @@
         </w:tc>
       </w:tr>
       <w:tr>
-        <w:tblPrEx>
-          <w:tblCellMar>
-            <w:top w:w="0" w:type="dxa"/>
-            <w:bottom w:w="0" w:type="dxa"/>
-          </w:tblCellMar>
-        </w:tblPrEx>
         <w:tc>
           <w:tcPr>
             <w:tcW w:w="2200" w:type="dxa"/>
@@ -11272,12 +10595,6 @@
         </w:tc>
       </w:tr>
       <w:tr>
-        <w:tblPrEx>
-          <w:tblCellMar>
-            <w:top w:w="0" w:type="dxa"/>
-            <w:bottom w:w="0" w:type="dxa"/>
-          </w:tblCellMar>
-        </w:tblPrEx>
         <w:tc>
           <w:tcPr>
             <w:tcW w:w="2200" w:type="dxa"/>
@@ -11436,12 +10753,6 @@
         </w:tc>
       </w:tr>
       <w:tr>
-        <w:tblPrEx>
-          <w:tblCellMar>
-            <w:top w:w="0" w:type="dxa"/>
-            <w:bottom w:w="0" w:type="dxa"/>
-          </w:tblCellMar>
-        </w:tblPrEx>
         <w:tc>
           <w:tcPr>
             <w:tcW w:w="2200" w:type="dxa"/>
@@ -11600,11 +10911,6 @@
         </w:tc>
       </w:tr>
     </w:tbl>
-    <w:p>
-      <w:pPr>
-        <w:spacing w:after="120"/>
-      </w:pPr>
-    </w:p>
     <w:p>
       <w:pPr>
         <w:spacing w:before="60" w:after="60"/>
@@ -11617,11 +10923,6 @@
         </w:rPr>
         <w:t>Policy &amp; Security</w:t>
       </w:r>
-    </w:p>
-    <w:p>
-      <w:pPr>
-        <w:spacing w:after="60"/>
-      </w:pPr>
     </w:p>
     <w:tbl>
       <w:tblPr>
@@ -11648,12 +10949,6 @@
         <w:gridCol w:w="1800"/>
       </w:tblGrid>
       <w:tr>
-        <w:tblPrEx>
-          <w:tblCellMar>
-            <w:top w:w="0" w:type="dxa"/>
-            <w:bottom w:w="0" w:type="dxa"/>
-          </w:tblCellMar>
-        </w:tblPrEx>
         <w:trPr>
           <w:tblHeader/>
         </w:trPr>
@@ -11809,12 +11104,6 @@
         </w:tc>
       </w:tr>
       <w:tr>
-        <w:tblPrEx>
-          <w:tblCellMar>
-            <w:top w:w="0" w:type="dxa"/>
-            <w:bottom w:w="0" w:type="dxa"/>
-          </w:tblCellMar>
-        </w:tblPrEx>
         <w:tc>
           <w:tcPr>
             <w:tcW w:w="2200" w:type="dxa"/>
@@ -11973,12 +11262,6 @@
         </w:tc>
       </w:tr>
       <w:tr>
-        <w:tblPrEx>
-          <w:tblCellMar>
-            <w:top w:w="0" w:type="dxa"/>
-            <w:bottom w:w="0" w:type="dxa"/>
-          </w:tblCellMar>
-        </w:tblPrEx>
         <w:tc>
           <w:tcPr>
             <w:tcW w:w="2200" w:type="dxa"/>
@@ -12137,12 +11420,6 @@
         </w:tc>
       </w:tr>
       <w:tr>
-        <w:tblPrEx>
-          <w:tblCellMar>
-            <w:top w:w="0" w:type="dxa"/>
-            <w:bottom w:w="0" w:type="dxa"/>
-          </w:tblCellMar>
-        </w:tblPrEx>
         <w:tc>
           <w:tcPr>
             <w:tcW w:w="2200" w:type="dxa"/>
@@ -12301,12 +11578,6 @@
         </w:tc>
       </w:tr>
       <w:tr>
-        <w:tblPrEx>
-          <w:tblCellMar>
-            <w:top w:w="0" w:type="dxa"/>
-            <w:bottom w:w="0" w:type="dxa"/>
-          </w:tblCellMar>
-        </w:tblPrEx>
         <w:tc>
           <w:tcPr>
             <w:tcW w:w="2200" w:type="dxa"/>
@@ -12358,23 +11629,7 @@
                 <w:sz w:val="18"/>
                 <w:szCs w:val="18"/>
               </w:rPr>
-              <w:t>Rules: zone, source/</w:t>
-            </w:r>
-            <w:proofErr w:type="spellStart"/>
-            <w:r>
-              <w:rPr>
-                <w:sz w:val="18"/>
-                <w:szCs w:val="18"/>
-              </w:rPr>
-              <w:t>dest</w:t>
-            </w:r>
-            <w:proofErr w:type="spellEnd"/>
-            <w:r>
-              <w:rPr>
-                <w:sz w:val="18"/>
-                <w:szCs w:val="18"/>
-              </w:rPr>
-              <w:t>, application, action, log</w:t>
+              <w:t>Rules: zone, source/dest, application, action, log</w:t>
             </w:r>
           </w:p>
         </w:tc>
@@ -12481,12 +11736,6 @@
         </w:tc>
       </w:tr>
       <w:tr>
-        <w:tblPrEx>
-          <w:tblCellMar>
-            <w:top w:w="0" w:type="dxa"/>
-            <w:bottom w:w="0" w:type="dxa"/>
-          </w:tblCellMar>
-        </w:tblPrEx>
         <w:tc>
           <w:tcPr>
             <w:tcW w:w="2200" w:type="dxa"/>
@@ -12512,7 +11761,6 @@
                 <w:sz w:val="19"/>
                 <w:szCs w:val="19"/>
               </w:rPr>
-              <w:lastRenderedPageBreak/>
               <w:t>NAT Rule Table</w:t>
             </w:r>
           </w:p>
@@ -12646,11 +11894,6 @@
         </w:tc>
       </w:tr>
     </w:tbl>
-    <w:p>
-      <w:pPr>
-        <w:spacing w:after="120"/>
-      </w:pPr>
-    </w:p>
     <w:p>
       <w:pPr>
         <w:spacing w:before="60" w:after="60"/>
@@ -12663,11 +11906,6 @@
         </w:rPr>
         <w:t>Overlay, Cloud &amp; Fabric</w:t>
       </w:r>
-    </w:p>
-    <w:p>
-      <w:pPr>
-        <w:spacing w:after="60"/>
-      </w:pPr>
     </w:p>
     <w:tbl>
       <w:tblPr>
@@ -12694,12 +11932,6 @@
         <w:gridCol w:w="1800"/>
       </w:tblGrid>
       <w:tr>
-        <w:tblPrEx>
-          <w:tblCellMar>
-            <w:top w:w="0" w:type="dxa"/>
-            <w:bottom w:w="0" w:type="dxa"/>
-          </w:tblCellMar>
-        </w:tblPrEx>
         <w:trPr>
           <w:tblHeader/>
         </w:trPr>
@@ -12729,6 +11961,7 @@
                 <w:sz w:val="19"/>
                 <w:szCs w:val="19"/>
               </w:rPr>
+              <w:lastRenderedPageBreak/>
               <w:t>Table</w:t>
             </w:r>
           </w:p>
@@ -12855,12 +12088,6 @@
         </w:tc>
       </w:tr>
       <w:tr>
-        <w:tblPrEx>
-          <w:tblCellMar>
-            <w:top w:w="0" w:type="dxa"/>
-            <w:bottom w:w="0" w:type="dxa"/>
-          </w:tblCellMar>
-        </w:tblPrEx>
         <w:tc>
           <w:tcPr>
             <w:tcW w:w="2200" w:type="dxa"/>
@@ -13019,12 +12246,6 @@
         </w:tc>
       </w:tr>
       <w:tr>
-        <w:tblPrEx>
-          <w:tblCellMar>
-            <w:top w:w="0" w:type="dxa"/>
-            <w:bottom w:w="0" w:type="dxa"/>
-          </w:tblCellMar>
-        </w:tblPrEx>
         <w:tc>
           <w:tcPr>
             <w:tcW w:w="2200" w:type="dxa"/>
@@ -13183,12 +12404,6 @@
         </w:tc>
       </w:tr>
       <w:tr>
-        <w:tblPrEx>
-          <w:tblCellMar>
-            <w:top w:w="0" w:type="dxa"/>
-            <w:bottom w:w="0" w:type="dxa"/>
-          </w:tblCellMar>
-        </w:tblPrEx>
         <w:tc>
           <w:tcPr>
             <w:tcW w:w="2200" w:type="dxa"/>
@@ -13347,12 +12562,6 @@
         </w:tc>
       </w:tr>
       <w:tr>
-        <w:tblPrEx>
-          <w:tblCellMar>
-            <w:top w:w="0" w:type="dxa"/>
-            <w:bottom w:w="0" w:type="dxa"/>
-          </w:tblCellMar>
-        </w:tblPrEx>
         <w:tc>
           <w:tcPr>
             <w:tcW w:w="2200" w:type="dxa"/>
@@ -13511,12 +12720,6 @@
         </w:tc>
       </w:tr>
       <w:tr>
-        <w:tblPrEx>
-          <w:tblCellMar>
-            <w:top w:w="0" w:type="dxa"/>
-            <w:bottom w:w="0" w:type="dxa"/>
-          </w:tblCellMar>
-        </w:tblPrEx>
         <w:tc>
           <w:tcPr>
             <w:tcW w:w="2200" w:type="dxa"/>
@@ -13675,12 +12878,6 @@
         </w:tc>
       </w:tr>
       <w:tr>
-        <w:tblPrEx>
-          <w:tblCellMar>
-            <w:top w:w="0" w:type="dxa"/>
-            <w:bottom w:w="0" w:type="dxa"/>
-          </w:tblCellMar>
-        </w:tblPrEx>
         <w:tc>
           <w:tcPr>
             <w:tcW w:w="2200" w:type="dxa"/>
@@ -13839,12 +13036,6 @@
         </w:tc>
       </w:tr>
       <w:tr>
-        <w:tblPrEx>
-          <w:tblCellMar>
-            <w:top w:w="0" w:type="dxa"/>
-            <w:bottom w:w="0" w:type="dxa"/>
-          </w:tblCellMar>
-        </w:tblPrEx>
         <w:tc>
           <w:tcPr>
             <w:tcW w:w="2200" w:type="dxa"/>
@@ -14020,11 +13211,6 @@
         </w:rPr>
         <w:t>Load Balancer &amp; Application Delivery</w:t>
       </w:r>
-    </w:p>
-    <w:p>
-      <w:pPr>
-        <w:spacing w:after="60"/>
-      </w:pPr>
     </w:p>
     <w:tbl>
       <w:tblPr>
@@ -14051,12 +13237,6 @@
         <w:gridCol w:w="1800"/>
       </w:tblGrid>
       <w:tr>
-        <w:tblPrEx>
-          <w:tblCellMar>
-            <w:top w:w="0" w:type="dxa"/>
-            <w:bottom w:w="0" w:type="dxa"/>
-          </w:tblCellMar>
-        </w:tblPrEx>
         <w:trPr>
           <w:tblHeader/>
         </w:trPr>
@@ -14086,7 +13266,6 @@
                 <w:sz w:val="19"/>
                 <w:szCs w:val="19"/>
               </w:rPr>
-              <w:lastRenderedPageBreak/>
               <w:t>Table</w:t>
             </w:r>
           </w:p>
@@ -14213,12 +13392,6 @@
         </w:tc>
       </w:tr>
       <w:tr>
-        <w:tblPrEx>
-          <w:tblCellMar>
-            <w:top w:w="0" w:type="dxa"/>
-            <w:bottom w:w="0" w:type="dxa"/>
-          </w:tblCellMar>
-        </w:tblPrEx>
         <w:tc>
           <w:tcPr>
             <w:tcW w:w="2200" w:type="dxa"/>
@@ -14377,12 +13550,6 @@
         </w:tc>
       </w:tr>
       <w:tr>
-        <w:tblPrEx>
-          <w:tblCellMar>
-            <w:top w:w="0" w:type="dxa"/>
-            <w:bottom w:w="0" w:type="dxa"/>
-          </w:tblCellMar>
-        </w:tblPrEx>
         <w:tc>
           <w:tcPr>
             <w:tcW w:w="2200" w:type="dxa"/>
@@ -14541,12 +13708,6 @@
         </w:tc>
       </w:tr>
       <w:tr>
-        <w:tblPrEx>
-          <w:tblCellMar>
-            <w:top w:w="0" w:type="dxa"/>
-            <w:bottom w:w="0" w:type="dxa"/>
-          </w:tblCellMar>
-        </w:tblPrEx>
         <w:tc>
           <w:tcPr>
             <w:tcW w:w="2200" w:type="dxa"/>
@@ -14705,12 +13866,6 @@
         </w:tc>
       </w:tr>
       <w:tr>
-        <w:tblPrEx>
-          <w:tblCellMar>
-            <w:top w:w="0" w:type="dxa"/>
-            <w:bottom w:w="0" w:type="dxa"/>
-          </w:tblCellMar>
-        </w:tblPrEx>
         <w:tc>
           <w:tcPr>
             <w:tcW w:w="2200" w:type="dxa"/>
@@ -14736,6 +13891,7 @@
                 <w:sz w:val="19"/>
                 <w:szCs w:val="19"/>
               </w:rPr>
+              <w:lastRenderedPageBreak/>
               <w:t>VPN Status Table</w:t>
             </w:r>
           </w:p>
@@ -14869,11 +14025,6 @@
         </w:tc>
       </w:tr>
     </w:tbl>
-    <w:p>
-      <w:pPr>
-        <w:spacing w:after="160"/>
-      </w:pPr>
-    </w:p>
     <w:p>
       <w:pPr>
         <w:pStyle w:val="Heading2"/>
@@ -14908,12 +14059,6 @@
         <w:gridCol w:w="2139"/>
       </w:tblGrid>
       <w:tr>
-        <w:tblPrEx>
-          <w:tblCellMar>
-            <w:top w:w="0" w:type="dxa"/>
-            <w:bottom w:w="0" w:type="dxa"/>
-          </w:tblCellMar>
-        </w:tblPrEx>
         <w:trPr>
           <w:tblHeader/>
         </w:trPr>
@@ -15069,12 +14214,6 @@
         </w:tc>
       </w:tr>
       <w:tr>
-        <w:tblPrEx>
-          <w:tblCellMar>
-            <w:top w:w="0" w:type="dxa"/>
-            <w:bottom w:w="0" w:type="dxa"/>
-          </w:tblCellMar>
-        </w:tblPrEx>
         <w:tc>
           <w:tcPr>
             <w:tcW w:w="2100" w:type="dxa"/>
@@ -15198,12 +14337,6 @@
         </w:tc>
       </w:tr>
       <w:tr>
-        <w:tblPrEx>
-          <w:tblCellMar>
-            <w:top w:w="0" w:type="dxa"/>
-            <w:bottom w:w="0" w:type="dxa"/>
-          </w:tblCellMar>
-        </w:tblPrEx>
         <w:tc>
           <w:tcPr>
             <w:tcW w:w="2100" w:type="dxa"/>
@@ -15327,12 +14460,6 @@
         </w:tc>
       </w:tr>
       <w:tr>
-        <w:tblPrEx>
-          <w:tblCellMar>
-            <w:top w:w="0" w:type="dxa"/>
-            <w:bottom w:w="0" w:type="dxa"/>
-          </w:tblCellMar>
-        </w:tblPrEx>
         <w:tc>
           <w:tcPr>
             <w:tcW w:w="2100" w:type="dxa"/>
@@ -15456,12 +14583,6 @@
         </w:tc>
       </w:tr>
       <w:tr>
-        <w:tblPrEx>
-          <w:tblCellMar>
-            <w:top w:w="0" w:type="dxa"/>
-            <w:bottom w:w="0" w:type="dxa"/>
-          </w:tblCellMar>
-        </w:tblPrEx>
         <w:tc>
           <w:tcPr>
             <w:tcW w:w="2100" w:type="dxa"/>
@@ -15596,12 +14717,6 @@
         </w:tc>
       </w:tr>
       <w:tr>
-        <w:tblPrEx>
-          <w:tblCellMar>
-            <w:top w:w="0" w:type="dxa"/>
-            <w:bottom w:w="0" w:type="dxa"/>
-          </w:tblCellMar>
-        </w:tblPrEx>
         <w:tc>
           <w:tcPr>
             <w:tcW w:w="2100" w:type="dxa"/>
@@ -15736,11 +14851,6 @@
         </w:tc>
       </w:tr>
     </w:tbl>
-    <w:p>
-      <w:pPr>
-        <w:spacing w:after="160"/>
-      </w:pPr>
-    </w:p>
     <w:p>
       <w:pPr>
         <w:pStyle w:val="Heading2"/>
@@ -15775,12 +14885,6 @@
         <w:gridCol w:w="2200"/>
       </w:tblGrid>
       <w:tr>
-        <w:tblPrEx>
-          <w:tblCellMar>
-            <w:top w:w="0" w:type="dxa"/>
-            <w:bottom w:w="0" w:type="dxa"/>
-          </w:tblCellMar>
-        </w:tblPrEx>
         <w:trPr>
           <w:tblHeader/>
         </w:trPr>
@@ -15936,12 +15040,6 @@
         </w:tc>
       </w:tr>
       <w:tr>
-        <w:tblPrEx>
-          <w:tblCellMar>
-            <w:top w:w="0" w:type="dxa"/>
-            <w:bottom w:w="0" w:type="dxa"/>
-          </w:tblCellMar>
-        </w:tblPrEx>
         <w:tc>
           <w:tcPr>
             <w:tcW w:w="2100" w:type="dxa"/>
@@ -16076,12 +15174,6 @@
         </w:tc>
       </w:tr>
       <w:tr>
-        <w:tblPrEx>
-          <w:tblCellMar>
-            <w:top w:w="0" w:type="dxa"/>
-            <w:bottom w:w="0" w:type="dxa"/>
-          </w:tblCellMar>
-        </w:tblPrEx>
         <w:tc>
           <w:tcPr>
             <w:tcW w:w="2100" w:type="dxa"/>
@@ -16205,12 +15297,6 @@
         </w:tc>
       </w:tr>
       <w:tr>
-        <w:tblPrEx>
-          <w:tblCellMar>
-            <w:top w:w="0" w:type="dxa"/>
-            <w:bottom w:w="0" w:type="dxa"/>
-          </w:tblCellMar>
-        </w:tblPrEx>
         <w:tc>
           <w:tcPr>
             <w:tcW w:w="2100" w:type="dxa"/>
@@ -16233,7 +15319,6 @@
                 <w:sz w:val="19"/>
                 <w:szCs w:val="19"/>
               </w:rPr>
-              <w:lastRenderedPageBreak/>
               <w:t>Software / Firmware Version</w:t>
             </w:r>
           </w:p>
@@ -16346,12 +15431,6 @@
         </w:tc>
       </w:tr>
       <w:tr>
-        <w:tblPrEx>
-          <w:tblCellMar>
-            <w:top w:w="0" w:type="dxa"/>
-            <w:bottom w:w="0" w:type="dxa"/>
-          </w:tblCellMar>
-        </w:tblPrEx>
         <w:tc>
           <w:tcPr>
             <w:tcW w:w="2100" w:type="dxa"/>
@@ -16521,11 +15600,6 @@
         <w:t>Check Yes or No for each module. This directly determines development scope and timeline.</w:t>
       </w:r>
     </w:p>
-    <w:p>
-      <w:pPr>
-        <w:spacing w:after="100"/>
-      </w:pPr>
-    </w:p>
     <w:tbl>
       <w:tblPr>
         <w:tblW w:w="9360" w:type="dxa"/>
@@ -16549,12 +15623,6 @@
         <w:gridCol w:w="4160"/>
       </w:tblGrid>
       <w:tr>
-        <w:tblPrEx>
-          <w:tblCellMar>
-            <w:top w:w="0" w:type="dxa"/>
-            <w:bottom w:w="0" w:type="dxa"/>
-          </w:tblCellMar>
-        </w:tblPrEx>
         <w:trPr>
           <w:tblHeader/>
         </w:trPr>
@@ -16650,12 +15718,6 @@
         </w:tc>
       </w:tr>
       <w:tr>
-        <w:tblPrEx>
-          <w:tblCellMar>
-            <w:top w:w="0" w:type="dxa"/>
-            <w:bottom w:w="0" w:type="dxa"/>
-          </w:tblCellMar>
-        </w:tblPrEx>
         <w:tc>
           <w:tcPr>
             <w:tcW w:w="3600" w:type="dxa"/>
@@ -16751,12 +15813,6 @@
         </w:tc>
       </w:tr>
       <w:tr>
-        <w:tblPrEx>
-          <w:tblCellMar>
-            <w:top w:w="0" w:type="dxa"/>
-            <w:bottom w:w="0" w:type="dxa"/>
-          </w:tblCellMar>
-        </w:tblPrEx>
         <w:tc>
           <w:tcPr>
             <w:tcW w:w="3600" w:type="dxa"/>
@@ -16779,6 +15835,7 @@
                 <w:sz w:val="19"/>
                 <w:szCs w:val="19"/>
               </w:rPr>
+              <w:lastRenderedPageBreak/>
               <w:t>Interface &amp; IP Collection</w:t>
             </w:r>
           </w:p>
@@ -16852,12 +15909,6 @@
         </w:tc>
       </w:tr>
       <w:tr>
-        <w:tblPrEx>
-          <w:tblCellMar>
-            <w:top w:w="0" w:type="dxa"/>
-            <w:bottom w:w="0" w:type="dxa"/>
-          </w:tblCellMar>
-        </w:tblPrEx>
         <w:tc>
           <w:tcPr>
             <w:tcW w:w="3600" w:type="dxa"/>
@@ -16953,12 +16004,6 @@
         </w:tc>
       </w:tr>
       <w:tr>
-        <w:tblPrEx>
-          <w:tblCellMar>
-            <w:top w:w="0" w:type="dxa"/>
-            <w:bottom w:w="0" w:type="dxa"/>
-          </w:tblCellMar>
-        </w:tblPrEx>
         <w:tc>
           <w:tcPr>
             <w:tcW w:w="3600" w:type="dxa"/>
@@ -17054,12 +16099,6 @@
         </w:tc>
       </w:tr>
       <w:tr>
-        <w:tblPrEx>
-          <w:tblCellMar>
-            <w:top w:w="0" w:type="dxa"/>
-            <w:bottom w:w="0" w:type="dxa"/>
-          </w:tblCellMar>
-        </w:tblPrEx>
         <w:tc>
           <w:tcPr>
             <w:tcW w:w="3600" w:type="dxa"/>
@@ -17155,12 +16194,6 @@
         </w:tc>
       </w:tr>
       <w:tr>
-        <w:tblPrEx>
-          <w:tblCellMar>
-            <w:top w:w="0" w:type="dxa"/>
-            <w:bottom w:w="0" w:type="dxa"/>
-          </w:tblCellMar>
-        </w:tblPrEx>
         <w:tc>
           <w:tcPr>
             <w:tcW w:w="3600" w:type="dxa"/>
@@ -17256,12 +16289,6 @@
         </w:tc>
       </w:tr>
       <w:tr>
-        <w:tblPrEx>
-          <w:tblCellMar>
-            <w:top w:w="0" w:type="dxa"/>
-            <w:bottom w:w="0" w:type="dxa"/>
-          </w:tblCellMar>
-        </w:tblPrEx>
         <w:tc>
           <w:tcPr>
             <w:tcW w:w="3600" w:type="dxa"/>
@@ -17357,12 +16384,6 @@
         </w:tc>
       </w:tr>
       <w:tr>
-        <w:tblPrEx>
-          <w:tblCellMar>
-            <w:top w:w="0" w:type="dxa"/>
-            <w:bottom w:w="0" w:type="dxa"/>
-          </w:tblCellMar>
-        </w:tblPrEx>
         <w:tc>
           <w:tcPr>
             <w:tcW w:w="3600" w:type="dxa"/>
@@ -17458,12 +16479,6 @@
         </w:tc>
       </w:tr>
       <w:tr>
-        <w:tblPrEx>
-          <w:tblCellMar>
-            <w:top w:w="0" w:type="dxa"/>
-            <w:bottom w:w="0" w:type="dxa"/>
-          </w:tblCellMar>
-        </w:tblPrEx>
         <w:tc>
           <w:tcPr>
             <w:tcW w:w="3600" w:type="dxa"/>
@@ -17559,12 +16574,6 @@
         </w:tc>
       </w:tr>
       <w:tr>
-        <w:tblPrEx>
-          <w:tblCellMar>
-            <w:top w:w="0" w:type="dxa"/>
-            <w:bottom w:w="0" w:type="dxa"/>
-          </w:tblCellMar>
-        </w:tblPrEx>
         <w:tc>
           <w:tcPr>
             <w:tcW w:w="3600" w:type="dxa"/>
@@ -17652,12 +16661,6 @@
         </w:tc>
       </w:tr>
       <w:tr>
-        <w:tblPrEx>
-          <w:tblCellMar>
-            <w:top w:w="0" w:type="dxa"/>
-            <w:bottom w:w="0" w:type="dxa"/>
-          </w:tblCellMar>
-        </w:tblPrEx>
         <w:tc>
           <w:tcPr>
             <w:tcW w:w="3600" w:type="dxa"/>
@@ -17753,12 +16756,6 @@
         </w:tc>
       </w:tr>
       <w:tr>
-        <w:tblPrEx>
-          <w:tblCellMar>
-            <w:top w:w="0" w:type="dxa"/>
-            <w:bottom w:w="0" w:type="dxa"/>
-          </w:tblCellMar>
-        </w:tblPrEx>
         <w:tc>
           <w:tcPr>
             <w:tcW w:w="3600" w:type="dxa"/>
@@ -17781,7 +16778,6 @@
                 <w:sz w:val="19"/>
                 <w:szCs w:val="19"/>
               </w:rPr>
-              <w:lastRenderedPageBreak/>
               <w:t>Policy / Security Rule Collection</w:t>
             </w:r>
           </w:p>
@@ -17847,12 +16843,6 @@
         </w:tc>
       </w:tr>
       <w:tr>
-        <w:tblPrEx>
-          <w:tblCellMar>
-            <w:top w:w="0" w:type="dxa"/>
-            <w:bottom w:w="0" w:type="dxa"/>
-          </w:tblCellMar>
-        </w:tblPrEx>
         <w:tc>
           <w:tcPr>
             <w:tcW w:w="3600" w:type="dxa"/>
@@ -17940,12 +16930,6 @@
         </w:tc>
       </w:tr>
       <w:tr>
-        <w:tblPrEx>
-          <w:tblCellMar>
-            <w:top w:w="0" w:type="dxa"/>
-            <w:bottom w:w="0" w:type="dxa"/>
-          </w:tblCellMar>
-        </w:tblPrEx>
         <w:tc>
           <w:tcPr>
             <w:tcW w:w="3600" w:type="dxa"/>
@@ -18070,11 +17054,6 @@
     </w:p>
     <w:p>
       <w:pPr>
-        <w:spacing w:after="100"/>
-      </w:pPr>
-    </w:p>
-    <w:p>
-      <w:pPr>
         <w:pStyle w:val="Heading2"/>
         <w:spacing w:after="120"/>
       </w:pPr>
@@ -18104,12 +17083,6 @@
         <w:gridCol w:w="6560"/>
       </w:tblGrid>
       <w:tr>
-        <w:tblPrEx>
-          <w:tblCellMar>
-            <w:top w:w="0" w:type="dxa"/>
-            <w:bottom w:w="0" w:type="dxa"/>
-          </w:tblCellMar>
-        </w:tblPrEx>
         <w:tc>
           <w:tcPr>
             <w:tcW w:w="2800" w:type="dxa"/>
@@ -18136,6 +17109,7 @@
                 <w:sz w:val="19"/>
                 <w:szCs w:val="19"/>
               </w:rPr>
+              <w:lastRenderedPageBreak/>
               <w:t>Endpoints Paginate Results?</w:t>
             </w:r>
           </w:p>
@@ -18183,12 +17157,6 @@
         </w:tc>
       </w:tr>
       <w:tr>
-        <w:tblPrEx>
-          <w:tblCellMar>
-            <w:top w:w="0" w:type="dxa"/>
-            <w:bottom w:w="0" w:type="dxa"/>
-          </w:tblCellMar>
-        </w:tblPrEx>
         <w:tc>
           <w:tcPr>
             <w:tcW w:w="2800" w:type="dxa"/>
@@ -18250,12 +17218,6 @@
         </w:tc>
       </w:tr>
       <w:tr>
-        <w:tblPrEx>
-          <w:tblCellMar>
-            <w:top w:w="0" w:type="dxa"/>
-            <w:bottom w:w="0" w:type="dxa"/>
-          </w:tblCellMar>
-        </w:tblPrEx>
         <w:tc>
           <w:tcPr>
             <w:tcW w:w="2800" w:type="dxa"/>
@@ -18317,12 +17279,6 @@
         </w:tc>
       </w:tr>
       <w:tr>
-        <w:tblPrEx>
-          <w:tblCellMar>
-            <w:top w:w="0" w:type="dxa"/>
-            <w:bottom w:w="0" w:type="dxa"/>
-          </w:tblCellMar>
-        </w:tblPrEx>
         <w:tc>
           <w:tcPr>
             <w:tcW w:w="2800" w:type="dxa"/>
@@ -18396,12 +17352,6 @@
         </w:tc>
       </w:tr>
       <w:tr>
-        <w:tblPrEx>
-          <w:tblCellMar>
-            <w:top w:w="0" w:type="dxa"/>
-            <w:bottom w:w="0" w:type="dxa"/>
-          </w:tblCellMar>
-        </w:tblPrEx>
         <w:tc>
           <w:tcPr>
             <w:tcW w:w="2800" w:type="dxa"/>
@@ -18463,11 +17413,6 @@
         </w:tc>
       </w:tr>
     </w:tbl>
-    <w:p>
-      <w:pPr>
-        <w:spacing w:after="140"/>
-      </w:pPr>
-    </w:p>
     <w:p>
       <w:pPr>
         <w:pStyle w:val="Heading2"/>
@@ -18499,12 +17444,6 @@
         <w:gridCol w:w="6560"/>
       </w:tblGrid>
       <w:tr>
-        <w:tblPrEx>
-          <w:tblCellMar>
-            <w:top w:w="0" w:type="dxa"/>
-            <w:bottom w:w="0" w:type="dxa"/>
-          </w:tblCellMar>
-        </w:tblPrEx>
         <w:tc>
           <w:tcPr>
             <w:tcW w:w="2800" w:type="dxa"/>
@@ -18578,12 +17517,6 @@
         </w:tc>
       </w:tr>
       <w:tr>
-        <w:tblPrEx>
-          <w:tblCellMar>
-            <w:top w:w="0" w:type="dxa"/>
-            <w:bottom w:w="0" w:type="dxa"/>
-          </w:tblCellMar>
-        </w:tblPrEx>
         <w:tc>
           <w:tcPr>
             <w:tcW w:w="2800" w:type="dxa"/>
@@ -18645,12 +17578,6 @@
         </w:tc>
       </w:tr>
       <w:tr>
-        <w:tblPrEx>
-          <w:tblCellMar>
-            <w:top w:w="0" w:type="dxa"/>
-            <w:bottom w:w="0" w:type="dxa"/>
-          </w:tblCellMar>
-        </w:tblPrEx>
         <w:tc>
           <w:tcPr>
             <w:tcW w:w="2800" w:type="dxa"/>
@@ -18748,12 +17675,6 @@
         </w:tc>
       </w:tr>
       <w:tr>
-        <w:tblPrEx>
-          <w:tblCellMar>
-            <w:top w:w="0" w:type="dxa"/>
-            <w:bottom w:w="0" w:type="dxa"/>
-          </w:tblCellMar>
-        </w:tblPrEx>
         <w:tc>
           <w:tcPr>
             <w:tcW w:w="2800" w:type="dxa"/>
@@ -18809,9 +17730,59 @@
                 <w:sz w:val="19"/>
                 <w:szCs w:val="19"/>
               </w:rPr>
-              <w:t xml:space="preserve">Does the 429 </w:t>
-            </w:r>
-            <w:proofErr w:type="gramStart"/>
+              <w:t>Does the 429 response include a Retry-After header?</w:t>
+            </w:r>
+          </w:p>
+        </w:tc>
+      </w:tr>
+      <w:tr>
+        <w:tc>
+          <w:tcPr>
+            <w:tcW w:w="2800" w:type="dxa"/>
+            <w:tcBorders>
+              <w:top w:val="single" w:sz="4" w:space="0" w:color="BBBBBB"/>
+              <w:left w:val="single" w:sz="4" w:space="0" w:color="BBBBBB"/>
+              <w:bottom w:val="single" w:sz="4" w:space="0" w:color="BBBBBB"/>
+              <w:right w:val="single" w:sz="4" w:space="0" w:color="BBBBBB"/>
+            </w:tcBorders>
+            <w:shd w:val="clear" w:color="auto" w:fill="EBF3FB"/>
+            <w:tcMar>
+              <w:top w:w="100" w:type="dxa"/>
+              <w:left w:w="140" w:type="dxa"/>
+              <w:bottom w:w="100" w:type="dxa"/>
+              <w:right w:w="140" w:type="dxa"/>
+            </w:tcMar>
+          </w:tcPr>
+          <w:p>
+            <w:r>
+              <w:rPr>
+                <w:b/>
+                <w:bCs/>
+                <w:color w:val="404040"/>
+                <w:sz w:val="19"/>
+                <w:szCs w:val="19"/>
+              </w:rPr>
+              <w:t>Recommended Retry Strategy</w:t>
+            </w:r>
+          </w:p>
+        </w:tc>
+        <w:tc>
+          <w:tcPr>
+            <w:tcW w:w="6560" w:type="dxa"/>
+            <w:tcBorders>
+              <w:top w:val="single" w:sz="4" w:space="0" w:color="BBBBBB"/>
+              <w:left w:val="single" w:sz="4" w:space="0" w:color="BBBBBB"/>
+              <w:bottom w:val="single" w:sz="4" w:space="0" w:color="BBBBBB"/>
+              <w:right w:val="single" w:sz="4" w:space="0" w:color="BBBBBB"/>
+            </w:tcBorders>
+            <w:tcMar>
+              <w:top w:w="100" w:type="dxa"/>
+              <w:left w:w="140" w:type="dxa"/>
+              <w:bottom w:w="100" w:type="dxa"/>
+              <w:right w:w="140" w:type="dxa"/>
+            </w:tcMar>
+          </w:tcPr>
+          <w:p>
             <w:r>
               <w:rPr>
                 <w:i/>
@@ -18820,107 +17791,18 @@
                 <w:sz w:val="19"/>
                 <w:szCs w:val="19"/>
               </w:rPr>
-              <w:t>response</w:t>
-            </w:r>
-            <w:proofErr w:type="gramEnd"/>
-            <w:r>
-              <w:rPr>
-                <w:i/>
-                <w:iCs/>
-                <w:color w:val="AAAAAA"/>
-                <w:sz w:val="19"/>
-                <w:szCs w:val="19"/>
-              </w:rPr>
-              <w:t xml:space="preserve"> include a Retry-After header?</w:t>
-            </w:r>
-          </w:p>
-        </w:tc>
-      </w:tr>
-      <w:tr>
-        <w:tblPrEx>
-          <w:tblCellMar>
-            <w:top w:w="0" w:type="dxa"/>
-            <w:bottom w:w="0" w:type="dxa"/>
-          </w:tblCellMar>
-        </w:tblPrEx>
-        <w:tc>
-          <w:tcPr>
-            <w:tcW w:w="2800" w:type="dxa"/>
-            <w:tcBorders>
-              <w:top w:val="single" w:sz="4" w:space="0" w:color="BBBBBB"/>
-              <w:left w:val="single" w:sz="4" w:space="0" w:color="BBBBBB"/>
-              <w:bottom w:val="single" w:sz="4" w:space="0" w:color="BBBBBB"/>
-              <w:right w:val="single" w:sz="4" w:space="0" w:color="BBBBBB"/>
-            </w:tcBorders>
-            <w:shd w:val="clear" w:color="auto" w:fill="EBF3FB"/>
-            <w:tcMar>
-              <w:top w:w="100" w:type="dxa"/>
-              <w:left w:w="140" w:type="dxa"/>
-              <w:bottom w:w="100" w:type="dxa"/>
-              <w:right w:w="140" w:type="dxa"/>
-            </w:tcMar>
-          </w:tcPr>
-          <w:p>
-            <w:r>
-              <w:rPr>
-                <w:b/>
-                <w:bCs/>
-                <w:color w:val="404040"/>
-                <w:sz w:val="19"/>
-                <w:szCs w:val="19"/>
-              </w:rPr>
-              <w:t>Recommended Retry Strategy</w:t>
-            </w:r>
-          </w:p>
-        </w:tc>
-        <w:tc>
-          <w:tcPr>
-            <w:tcW w:w="6560" w:type="dxa"/>
-            <w:tcBorders>
-              <w:top w:val="single" w:sz="4" w:space="0" w:color="BBBBBB"/>
-              <w:left w:val="single" w:sz="4" w:space="0" w:color="BBBBBB"/>
-              <w:bottom w:val="single" w:sz="4" w:space="0" w:color="BBBBBB"/>
-              <w:right w:val="single" w:sz="4" w:space="0" w:color="BBBBBB"/>
-            </w:tcBorders>
-            <w:tcMar>
-              <w:top w:w="100" w:type="dxa"/>
-              <w:left w:w="140" w:type="dxa"/>
-              <w:bottom w:w="100" w:type="dxa"/>
-              <w:right w:w="140" w:type="dxa"/>
-            </w:tcMar>
-          </w:tcPr>
-          <w:p>
-            <w:r>
-              <w:rPr>
-                <w:i/>
-                <w:iCs/>
-                <w:color w:val="AAAAAA"/>
-                <w:sz w:val="19"/>
-                <w:szCs w:val="19"/>
-              </w:rPr>
               <w:t>e.g. exponential back-off, fixed 5 s delay</w:t>
             </w:r>
           </w:p>
         </w:tc>
       </w:tr>
     </w:tbl>
-    <w:p>
-      <w:pPr>
-        <w:spacing w:after="140"/>
-      </w:pPr>
-    </w:p>
-    <w:p>
-      <w:pPr>
-        <w:spacing w:after="140"/>
-      </w:pPr>
-    </w:p>
     <w:p>
       <w:pPr>
         <w:pStyle w:val="Heading2"/>
         <w:spacing w:after="120"/>
       </w:pPr>
       <w:r>
-        <w:lastRenderedPageBreak/>
         <w:t>6.3  Error Handling &amp; Timeouts</w:t>
       </w:r>
     </w:p>
@@ -18946,12 +17828,6 @@
         <w:gridCol w:w="6560"/>
       </w:tblGrid>
       <w:tr>
-        <w:tblPrEx>
-          <w:tblCellMar>
-            <w:top w:w="0" w:type="dxa"/>
-            <w:bottom w:w="0" w:type="dxa"/>
-          </w:tblCellMar>
-        </w:tblPrEx>
         <w:tc>
           <w:tcPr>
             <w:tcW w:w="2800" w:type="dxa"/>
@@ -19037,12 +17913,6 @@
         </w:tc>
       </w:tr>
       <w:tr>
-        <w:tblPrEx>
-          <w:tblCellMar>
-            <w:top w:w="0" w:type="dxa"/>
-            <w:bottom w:w="0" w:type="dxa"/>
-          </w:tblCellMar>
-        </w:tblPrEx>
         <w:tc>
           <w:tcPr>
             <w:tcW w:w="2800" w:type="dxa"/>
@@ -19069,8 +17939,59 @@
                 <w:sz w:val="19"/>
                 <w:szCs w:val="19"/>
               </w:rPr>
-              <w:t>Retriable</w:t>
-            </w:r>
+              <w:t>Retriable HTTP Status Codes</w:t>
+            </w:r>
+          </w:p>
+        </w:tc>
+        <w:tc>
+          <w:tcPr>
+            <w:tcW w:w="6560" w:type="dxa"/>
+            <w:tcBorders>
+              <w:top w:val="single" w:sz="4" w:space="0" w:color="BBBBBB"/>
+              <w:left w:val="single" w:sz="4" w:space="0" w:color="BBBBBB"/>
+              <w:bottom w:val="single" w:sz="4" w:space="0" w:color="BBBBBB"/>
+              <w:right w:val="single" w:sz="4" w:space="0" w:color="BBBBBB"/>
+            </w:tcBorders>
+            <w:tcMar>
+              <w:top w:w="100" w:type="dxa"/>
+              <w:left w:w="140" w:type="dxa"/>
+              <w:bottom w:w="100" w:type="dxa"/>
+              <w:right w:w="140" w:type="dxa"/>
+            </w:tcMar>
+          </w:tcPr>
+          <w:p>
+            <w:r>
+              <w:rPr>
+                <w:i/>
+                <w:iCs/>
+                <w:color w:val="AAAAAA"/>
+                <w:sz w:val="19"/>
+                <w:szCs w:val="19"/>
+              </w:rPr>
+              <w:t>e.g. 429, 503, 504. Do NOT retry 400 / 401 / 403.</w:t>
+            </w:r>
+          </w:p>
+        </w:tc>
+      </w:tr>
+      <w:tr>
+        <w:tc>
+          <w:tcPr>
+            <w:tcW w:w="2800" w:type="dxa"/>
+            <w:tcBorders>
+              <w:top w:val="single" w:sz="4" w:space="0" w:color="BBBBBB"/>
+              <w:left w:val="single" w:sz="4" w:space="0" w:color="BBBBBB"/>
+              <w:bottom w:val="single" w:sz="4" w:space="0" w:color="BBBBBB"/>
+              <w:right w:val="single" w:sz="4" w:space="0" w:color="BBBBBB"/>
+            </w:tcBorders>
+            <w:shd w:val="clear" w:color="auto" w:fill="EBF3FB"/>
+            <w:tcMar>
+              <w:top w:w="100" w:type="dxa"/>
+              <w:left w:w="140" w:type="dxa"/>
+              <w:bottom w:w="100" w:type="dxa"/>
+              <w:right w:w="140" w:type="dxa"/>
+            </w:tcMar>
+          </w:tcPr>
+          <w:p>
             <w:r>
               <w:rPr>
                 <w:b/>
@@ -19079,7 +18000,7 @@
                 <w:sz w:val="19"/>
                 <w:szCs w:val="19"/>
               </w:rPr>
-              <w:t xml:space="preserve"> HTTP Status Codes</w:t>
+              <w:t>Connection Timeout</w:t>
             </w:r>
           </w:p>
         </w:tc>
@@ -19108,18 +18029,12 @@
                 <w:sz w:val="19"/>
                 <w:szCs w:val="19"/>
               </w:rPr>
-              <w:t>e.g. 429, 503, 504. Do NOT retry 400 / 401 / 403.</w:t>
+              <w:t>Recommended value in seconds</w:t>
             </w:r>
           </w:p>
         </w:tc>
       </w:tr>
       <w:tr>
-        <w:tblPrEx>
-          <w:tblCellMar>
-            <w:top w:w="0" w:type="dxa"/>
-            <w:bottom w:w="0" w:type="dxa"/>
-          </w:tblCellMar>
-        </w:tblPrEx>
         <w:tc>
           <w:tcPr>
             <w:tcW w:w="2800" w:type="dxa"/>
@@ -19146,7 +18061,7 @@
                 <w:sz w:val="19"/>
                 <w:szCs w:val="19"/>
               </w:rPr>
-              <w:t>Connection Timeout</w:t>
+              <w:t>Read Timeout</w:t>
             </w:r>
           </w:p>
         </w:tc>
@@ -19181,12 +18096,6 @@
         </w:tc>
       </w:tr>
       <w:tr>
-        <w:tblPrEx>
-          <w:tblCellMar>
-            <w:top w:w="0" w:type="dxa"/>
-            <w:bottom w:w="0" w:type="dxa"/>
-          </w:tblCellMar>
-        </w:tblPrEx>
         <w:tc>
           <w:tcPr>
             <w:tcW w:w="2800" w:type="dxa"/>
@@ -19213,73 +18122,6 @@
                 <w:sz w:val="19"/>
                 <w:szCs w:val="19"/>
               </w:rPr>
-              <w:t>Read Timeout</w:t>
-            </w:r>
-          </w:p>
-        </w:tc>
-        <w:tc>
-          <w:tcPr>
-            <w:tcW w:w="6560" w:type="dxa"/>
-            <w:tcBorders>
-              <w:top w:val="single" w:sz="4" w:space="0" w:color="BBBBBB"/>
-              <w:left w:val="single" w:sz="4" w:space="0" w:color="BBBBBB"/>
-              <w:bottom w:val="single" w:sz="4" w:space="0" w:color="BBBBBB"/>
-              <w:right w:val="single" w:sz="4" w:space="0" w:color="BBBBBB"/>
-            </w:tcBorders>
-            <w:tcMar>
-              <w:top w:w="100" w:type="dxa"/>
-              <w:left w:w="140" w:type="dxa"/>
-              <w:bottom w:w="100" w:type="dxa"/>
-              <w:right w:w="140" w:type="dxa"/>
-            </w:tcMar>
-          </w:tcPr>
-          <w:p>
-            <w:r>
-              <w:rPr>
-                <w:i/>
-                <w:iCs/>
-                <w:color w:val="AAAAAA"/>
-                <w:sz w:val="19"/>
-                <w:szCs w:val="19"/>
-              </w:rPr>
-              <w:t>Recommended value in seconds</w:t>
-            </w:r>
-          </w:p>
-        </w:tc>
-      </w:tr>
-      <w:tr>
-        <w:tblPrEx>
-          <w:tblCellMar>
-            <w:top w:w="0" w:type="dxa"/>
-            <w:bottom w:w="0" w:type="dxa"/>
-          </w:tblCellMar>
-        </w:tblPrEx>
-        <w:tc>
-          <w:tcPr>
-            <w:tcW w:w="2800" w:type="dxa"/>
-            <w:tcBorders>
-              <w:top w:val="single" w:sz="4" w:space="0" w:color="BBBBBB"/>
-              <w:left w:val="single" w:sz="4" w:space="0" w:color="BBBBBB"/>
-              <w:bottom w:val="single" w:sz="4" w:space="0" w:color="BBBBBB"/>
-              <w:right w:val="single" w:sz="4" w:space="0" w:color="BBBBBB"/>
-            </w:tcBorders>
-            <w:shd w:val="clear" w:color="auto" w:fill="EBF3FB"/>
-            <w:tcMar>
-              <w:top w:w="100" w:type="dxa"/>
-              <w:left w:w="140" w:type="dxa"/>
-              <w:bottom w:w="100" w:type="dxa"/>
-              <w:right w:w="140" w:type="dxa"/>
-            </w:tcMar>
-          </w:tcPr>
-          <w:p>
-            <w:r>
-              <w:rPr>
-                <w:b/>
-                <w:bCs/>
-                <w:color w:val="404040"/>
-                <w:sz w:val="19"/>
-                <w:szCs w:val="19"/>
-              </w:rPr>
               <w:t>GET Idempotent / Safe to Retry?</w:t>
             </w:r>
           </w:p>
@@ -19327,11 +18169,6 @@
         </w:tc>
       </w:tr>
     </w:tbl>
-    <w:p>
-      <w:pPr>
-        <w:spacing w:after="140"/>
-      </w:pPr>
-    </w:p>
     <w:p>
       <w:pPr>
         <w:pStyle w:val="Heading2"/>
@@ -19363,12 +18200,6 @@
         <w:gridCol w:w="6560"/>
       </w:tblGrid>
       <w:tr>
-        <w:tblPrEx>
-          <w:tblCellMar>
-            <w:top w:w="0" w:type="dxa"/>
-            <w:bottom w:w="0" w:type="dxa"/>
-          </w:tblCellMar>
-        </w:tblPrEx>
         <w:tc>
           <w:tcPr>
             <w:tcW w:w="2800" w:type="dxa"/>
@@ -19442,12 +18273,6 @@
         </w:tc>
       </w:tr>
       <w:tr>
-        <w:tblPrEx>
-          <w:tblCellMar>
-            <w:top w:w="0" w:type="dxa"/>
-            <w:bottom w:w="0" w:type="dxa"/>
-          </w:tblCellMar>
-        </w:tblPrEx>
         <w:tc>
           <w:tcPr>
             <w:tcW w:w="2800" w:type="dxa"/>
@@ -19509,12 +18334,6 @@
         </w:tc>
       </w:tr>
       <w:tr>
-        <w:tblPrEx>
-          <w:tblCellMar>
-            <w:top w:w="0" w:type="dxa"/>
-            <w:bottom w:w="0" w:type="dxa"/>
-          </w:tblCellMar>
-        </w:tblPrEx>
         <w:tc>
           <w:tcPr>
             <w:tcW w:w="2800" w:type="dxa"/>
@@ -19541,6 +18360,7 @@
                 <w:sz w:val="19"/>
                 <w:szCs w:val="19"/>
               </w:rPr>
+              <w:lastRenderedPageBreak/>
               <w:t>Bulk / Batch API Available?</w:t>
             </w:r>
           </w:p>
@@ -19588,12 +18408,6 @@
         </w:tc>
       </w:tr>
       <w:tr>
-        <w:tblPrEx>
-          <w:tblCellMar>
-            <w:top w:w="0" w:type="dxa"/>
-            <w:bottom w:w="0" w:type="dxa"/>
-          </w:tblCellMar>
-        </w:tblPrEx>
         <w:tc>
           <w:tcPr>
             <w:tcW w:w="2800" w:type="dxa"/>
@@ -19667,11 +18481,6 @@
         </w:tc>
       </w:tr>
     </w:tbl>
-    <w:p>
-      <w:pPr>
-        <w:spacing w:after="200"/>
-      </w:pPr>
-    </w:p>
     <w:p>
       <w:pPr>
         <w:pStyle w:val="Heading1"/>
@@ -19699,21 +18508,8 @@
         <w:spacing w:before="60" w:after="60"/>
       </w:pPr>
       <w:r>
-        <w:t xml:space="preserve">A test environment is required for development and </w:t>
+        <w:t>A test environment is required for development and validation.If no lab is available, provide API response samples for every endpoint in Section 4.</w:t>
       </w:r>
-      <w:proofErr w:type="spellStart"/>
-      <w:r>
-        <w:t>validation.If</w:t>
-      </w:r>
-      <w:proofErr w:type="spellEnd"/>
-      <w:r>
-        <w:t xml:space="preserve"> no lab is available, provide API response samples for every endpoint in Section 4.</w:t>
-      </w:r>
-    </w:p>
-    <w:p>
-      <w:pPr>
-        <w:spacing w:after="100"/>
-      </w:pPr>
     </w:p>
     <w:tbl>
       <w:tblPr>
@@ -19737,12 +18533,6 @@
         <w:gridCol w:w="6560"/>
       </w:tblGrid>
       <w:tr>
-        <w:tblPrEx>
-          <w:tblCellMar>
-            <w:top w:w="0" w:type="dxa"/>
-            <w:bottom w:w="0" w:type="dxa"/>
-          </w:tblCellMar>
-        </w:tblPrEx>
         <w:tc>
           <w:tcPr>
             <w:tcW w:w="2800" w:type="dxa"/>
@@ -19804,12 +18594,6 @@
         </w:tc>
       </w:tr>
       <w:tr>
-        <w:tblPrEx>
-          <w:tblCellMar>
-            <w:top w:w="0" w:type="dxa"/>
-            <w:bottom w:w="0" w:type="dxa"/>
-          </w:tblCellMar>
-        </w:tblPrEx>
         <w:tc>
           <w:tcPr>
             <w:tcW w:w="2800" w:type="dxa"/>
@@ -19871,12 +18655,6 @@
         </w:tc>
       </w:tr>
       <w:tr>
-        <w:tblPrEx>
-          <w:tblCellMar>
-            <w:top w:w="0" w:type="dxa"/>
-            <w:bottom w:w="0" w:type="dxa"/>
-          </w:tblCellMar>
-        </w:tblPrEx>
         <w:tc>
           <w:tcPr>
             <w:tcW w:w="2800" w:type="dxa"/>
@@ -19938,12 +18716,6 @@
         </w:tc>
       </w:tr>
       <w:tr>
-        <w:tblPrEx>
-          <w:tblCellMar>
-            <w:top w:w="0" w:type="dxa"/>
-            <w:bottom w:w="0" w:type="dxa"/>
-          </w:tblCellMar>
-        </w:tblPrEx>
         <w:tc>
           <w:tcPr>
             <w:tcW w:w="2800" w:type="dxa"/>
@@ -19999,9 +18771,144 @@
                 <w:sz w:val="19"/>
                 <w:szCs w:val="19"/>
               </w:rPr>
-              <w:t xml:space="preserve">List all device </w:t>
-            </w:r>
-            <w:proofErr w:type="gramStart"/>
+              <w:t>List all device types present</w:t>
+            </w:r>
+          </w:p>
+        </w:tc>
+      </w:tr>
+      <w:tr>
+        <w:tc>
+          <w:tcPr>
+            <w:tcW w:w="2800" w:type="dxa"/>
+            <w:tcBorders>
+              <w:top w:val="single" w:sz="4" w:space="0" w:color="BBBBBB"/>
+              <w:left w:val="single" w:sz="4" w:space="0" w:color="BBBBBB"/>
+              <w:bottom w:val="single" w:sz="4" w:space="0" w:color="BBBBBB"/>
+              <w:right w:val="single" w:sz="4" w:space="0" w:color="BBBBBB"/>
+            </w:tcBorders>
+            <w:shd w:val="clear" w:color="auto" w:fill="EBF3FB"/>
+            <w:tcMar>
+              <w:top w:w="100" w:type="dxa"/>
+              <w:left w:w="140" w:type="dxa"/>
+              <w:bottom w:w="100" w:type="dxa"/>
+              <w:right w:w="140" w:type="dxa"/>
+            </w:tcMar>
+          </w:tcPr>
+          <w:p>
+            <w:r>
+              <w:rPr>
+                <w:b/>
+                <w:bCs/>
+                <w:color w:val="404040"/>
+                <w:sz w:val="19"/>
+                <w:szCs w:val="19"/>
+              </w:rPr>
+              <w:t>Network Reachability</w:t>
+            </w:r>
+          </w:p>
+        </w:tc>
+        <w:tc>
+          <w:tcPr>
+            <w:tcW w:w="6560" w:type="dxa"/>
+            <w:tcBorders>
+              <w:top w:val="single" w:sz="4" w:space="0" w:color="BBBBBB"/>
+              <w:left w:val="single" w:sz="4" w:space="0" w:color="BBBBBB"/>
+              <w:bottom w:val="single" w:sz="4" w:space="0" w:color="BBBBBB"/>
+              <w:right w:val="single" w:sz="4" w:space="0" w:color="BBBBBB"/>
+            </w:tcBorders>
+            <w:tcMar>
+              <w:top w:w="100" w:type="dxa"/>
+              <w:left w:w="140" w:type="dxa"/>
+              <w:bottom w:w="100" w:type="dxa"/>
+              <w:right w:w="140" w:type="dxa"/>
+            </w:tcMar>
+          </w:tcPr>
+          <w:p>
+            <w:pPr>
+              <w:spacing w:before="40" w:after="40"/>
+            </w:pPr>
+            <w:r>
+              <w:rPr>
+                <w:sz w:val="19"/>
+                <w:szCs w:val="19"/>
+              </w:rPr>
+              <w:t>☐  Direct access</w:t>
+            </w:r>
+          </w:p>
+          <w:p>
+            <w:pPr>
+              <w:spacing w:before="40" w:after="40"/>
+            </w:pPr>
+            <w:r>
+              <w:rPr>
+                <w:sz w:val="19"/>
+                <w:szCs w:val="19"/>
+              </w:rPr>
+              <w:t>☐  VPN required</w:t>
+            </w:r>
+          </w:p>
+          <w:p>
+            <w:pPr>
+              <w:spacing w:before="40" w:after="40"/>
+            </w:pPr>
+            <w:r>
+              <w:rPr>
+                <w:sz w:val="19"/>
+                <w:szCs w:val="19"/>
+              </w:rPr>
+              <w:t>☐  Jump host required</w:t>
+            </w:r>
+          </w:p>
+        </w:tc>
+      </w:tr>
+      <w:tr>
+        <w:tc>
+          <w:tcPr>
+            <w:tcW w:w="2800" w:type="dxa"/>
+            <w:tcBorders>
+              <w:top w:val="single" w:sz="4" w:space="0" w:color="BBBBBB"/>
+              <w:left w:val="single" w:sz="4" w:space="0" w:color="BBBBBB"/>
+              <w:bottom w:val="single" w:sz="4" w:space="0" w:color="BBBBBB"/>
+              <w:right w:val="single" w:sz="4" w:space="0" w:color="BBBBBB"/>
+            </w:tcBorders>
+            <w:shd w:val="clear" w:color="auto" w:fill="EBF3FB"/>
+            <w:tcMar>
+              <w:top w:w="100" w:type="dxa"/>
+              <w:left w:w="140" w:type="dxa"/>
+              <w:bottom w:w="100" w:type="dxa"/>
+              <w:right w:w="140" w:type="dxa"/>
+            </w:tcMar>
+          </w:tcPr>
+          <w:p>
+            <w:r>
+              <w:rPr>
+                <w:b/>
+                <w:bCs/>
+                <w:color w:val="404040"/>
+                <w:sz w:val="19"/>
+                <w:szCs w:val="19"/>
+              </w:rPr>
+              <w:t>Test Data Populated?</w:t>
+            </w:r>
+          </w:p>
+        </w:tc>
+        <w:tc>
+          <w:tcPr>
+            <w:tcW w:w="6560" w:type="dxa"/>
+            <w:tcBorders>
+              <w:top w:val="single" w:sz="4" w:space="0" w:color="BBBBBB"/>
+              <w:left w:val="single" w:sz="4" w:space="0" w:color="BBBBBB"/>
+              <w:bottom w:val="single" w:sz="4" w:space="0" w:color="BBBBBB"/>
+              <w:right w:val="single" w:sz="4" w:space="0" w:color="BBBBBB"/>
+            </w:tcBorders>
+            <w:tcMar>
+              <w:top w:w="100" w:type="dxa"/>
+              <w:left w:w="140" w:type="dxa"/>
+              <w:bottom w:w="100" w:type="dxa"/>
+              <w:right w:w="140" w:type="dxa"/>
+            </w:tcMar>
+          </w:tcPr>
+          <w:p>
             <w:r>
               <w:rPr>
                 <w:i/>
@@ -20010,9 +18917,363 @@
                 <w:sz w:val="19"/>
                 <w:szCs w:val="19"/>
               </w:rPr>
-              <w:t>types</w:t>
-            </w:r>
-            <w:proofErr w:type="gramEnd"/>
+              <w:t>Are route tables, ARP/MAC, topology, and policy data populated?</w:t>
+            </w:r>
+          </w:p>
+        </w:tc>
+      </w:tr>
+      <w:tr>
+        <w:tc>
+          <w:tcPr>
+            <w:tcW w:w="2800" w:type="dxa"/>
+            <w:tcBorders>
+              <w:top w:val="single" w:sz="4" w:space="0" w:color="BBBBBB"/>
+              <w:left w:val="single" w:sz="4" w:space="0" w:color="BBBBBB"/>
+              <w:bottom w:val="single" w:sz="4" w:space="0" w:color="BBBBBB"/>
+              <w:right w:val="single" w:sz="4" w:space="0" w:color="BBBBBB"/>
+            </w:tcBorders>
+            <w:shd w:val="clear" w:color="auto" w:fill="EBF3FB"/>
+            <w:tcMar>
+              <w:top w:w="100" w:type="dxa"/>
+              <w:left w:w="140" w:type="dxa"/>
+              <w:bottom w:w="100" w:type="dxa"/>
+              <w:right w:w="140" w:type="dxa"/>
+            </w:tcMar>
+          </w:tcPr>
+          <w:p>
+            <w:r>
+              <w:rPr>
+                <w:b/>
+                <w:bCs/>
+                <w:color w:val="404040"/>
+                <w:sz w:val="19"/>
+                <w:szCs w:val="19"/>
+              </w:rPr>
+              <w:t>Real-time API Available?</w:t>
+            </w:r>
+          </w:p>
+        </w:tc>
+        <w:tc>
+          <w:tcPr>
+            <w:tcW w:w="6560" w:type="dxa"/>
+            <w:tcBorders>
+              <w:top w:val="single" w:sz="4" w:space="0" w:color="BBBBBB"/>
+              <w:left w:val="single" w:sz="4" w:space="0" w:color="BBBBBB"/>
+              <w:bottom w:val="single" w:sz="4" w:space="0" w:color="BBBBBB"/>
+              <w:right w:val="single" w:sz="4" w:space="0" w:color="BBBBBB"/>
+            </w:tcBorders>
+            <w:tcMar>
+              <w:top w:w="100" w:type="dxa"/>
+              <w:left w:w="140" w:type="dxa"/>
+              <w:bottom w:w="100" w:type="dxa"/>
+              <w:right w:w="140" w:type="dxa"/>
+            </w:tcMar>
+          </w:tcPr>
+          <w:p>
+            <w:pPr>
+              <w:spacing w:before="40" w:after="40"/>
+            </w:pPr>
+            <w:r>
+              <w:rPr>
+                <w:sz w:val="19"/>
+                <w:szCs w:val="19"/>
+              </w:rPr>
+              <w:t>☐  Yes</w:t>
+            </w:r>
+          </w:p>
+          <w:p>
+            <w:pPr>
+              <w:spacing w:before="40" w:after="40"/>
+            </w:pPr>
+            <w:r>
+              <w:rPr>
+                <w:sz w:val="19"/>
+                <w:szCs w:val="19"/>
+              </w:rPr>
+              <w:t>☐  No</w:t>
+            </w:r>
+          </w:p>
+        </w:tc>
+      </w:tr>
+      <w:tr>
+        <w:tc>
+          <w:tcPr>
+            <w:tcW w:w="2800" w:type="dxa"/>
+            <w:tcBorders>
+              <w:top w:val="single" w:sz="4" w:space="0" w:color="BBBBBB"/>
+              <w:left w:val="single" w:sz="4" w:space="0" w:color="BBBBBB"/>
+              <w:bottom w:val="single" w:sz="4" w:space="0" w:color="BBBBBB"/>
+              <w:right w:val="single" w:sz="4" w:space="0" w:color="BBBBBB"/>
+            </w:tcBorders>
+            <w:shd w:val="clear" w:color="auto" w:fill="EBF3FB"/>
+            <w:tcMar>
+              <w:top w:w="100" w:type="dxa"/>
+              <w:left w:w="140" w:type="dxa"/>
+              <w:bottom w:w="100" w:type="dxa"/>
+              <w:right w:w="140" w:type="dxa"/>
+            </w:tcMar>
+          </w:tcPr>
+          <w:p>
+            <w:r>
+              <w:rPr>
+                <w:b/>
+                <w:bCs/>
+                <w:color w:val="404040"/>
+                <w:sz w:val="19"/>
+                <w:szCs w:val="19"/>
+              </w:rPr>
+              <w:t>SDK Installed on Server?</w:t>
+            </w:r>
+          </w:p>
+        </w:tc>
+        <w:tc>
+          <w:tcPr>
+            <w:tcW w:w="6560" w:type="dxa"/>
+            <w:tcBorders>
+              <w:top w:val="single" w:sz="4" w:space="0" w:color="BBBBBB"/>
+              <w:left w:val="single" w:sz="4" w:space="0" w:color="BBBBBB"/>
+              <w:bottom w:val="single" w:sz="4" w:space="0" w:color="BBBBBB"/>
+              <w:right w:val="single" w:sz="4" w:space="0" w:color="BBBBBB"/>
+            </w:tcBorders>
+            <w:tcMar>
+              <w:top w:w="100" w:type="dxa"/>
+              <w:left w:w="140" w:type="dxa"/>
+              <w:bottom w:w="100" w:type="dxa"/>
+              <w:right w:w="140" w:type="dxa"/>
+            </w:tcMar>
+          </w:tcPr>
+          <w:p>
+            <w:pPr>
+              <w:spacing w:before="40" w:after="40"/>
+            </w:pPr>
+            <w:r>
+              <w:rPr>
+                <w:sz w:val="19"/>
+                <w:szCs w:val="19"/>
+              </w:rPr>
+              <w:t>☐  Yes</w:t>
+            </w:r>
+          </w:p>
+          <w:p>
+            <w:pPr>
+              <w:spacing w:before="40" w:after="40"/>
+            </w:pPr>
+            <w:r>
+              <w:rPr>
+                <w:sz w:val="19"/>
+                <w:szCs w:val="19"/>
+              </w:rPr>
+              <w:t>☐  No</w:t>
+            </w:r>
+          </w:p>
+          <w:p>
+            <w:pPr>
+              <w:spacing w:before="40" w:after="40"/>
+            </w:pPr>
+            <w:r>
+              <w:rPr>
+                <w:sz w:val="19"/>
+                <w:szCs w:val="19"/>
+              </w:rPr>
+              <w:t>☐  N/A</w:t>
+            </w:r>
+          </w:p>
+        </w:tc>
+      </w:tr>
+      <w:tr>
+        <w:tc>
+          <w:tcPr>
+            <w:tcW w:w="2800" w:type="dxa"/>
+            <w:tcBorders>
+              <w:top w:val="single" w:sz="4" w:space="0" w:color="BBBBBB"/>
+              <w:left w:val="single" w:sz="4" w:space="0" w:color="BBBBBB"/>
+              <w:bottom w:val="single" w:sz="4" w:space="0" w:color="BBBBBB"/>
+              <w:right w:val="single" w:sz="4" w:space="0" w:color="BBBBBB"/>
+            </w:tcBorders>
+            <w:shd w:val="clear" w:color="auto" w:fill="EBF3FB"/>
+            <w:tcMar>
+              <w:top w:w="100" w:type="dxa"/>
+              <w:left w:w="140" w:type="dxa"/>
+              <w:bottom w:w="100" w:type="dxa"/>
+              <w:right w:w="140" w:type="dxa"/>
+            </w:tcMar>
+          </w:tcPr>
+          <w:p>
+            <w:r>
+              <w:rPr>
+                <w:b/>
+                <w:bCs/>
+                <w:color w:val="404040"/>
+                <w:sz w:val="19"/>
+                <w:szCs w:val="19"/>
+              </w:rPr>
+              <w:t>Multi-region / Multi-account?</w:t>
+            </w:r>
+          </w:p>
+        </w:tc>
+        <w:tc>
+          <w:tcPr>
+            <w:tcW w:w="6560" w:type="dxa"/>
+            <w:tcBorders>
+              <w:top w:val="single" w:sz="4" w:space="0" w:color="BBBBBB"/>
+              <w:left w:val="single" w:sz="4" w:space="0" w:color="BBBBBB"/>
+              <w:bottom w:val="single" w:sz="4" w:space="0" w:color="BBBBBB"/>
+              <w:right w:val="single" w:sz="4" w:space="0" w:color="BBBBBB"/>
+            </w:tcBorders>
+            <w:tcMar>
+              <w:top w:w="100" w:type="dxa"/>
+              <w:left w:w="140" w:type="dxa"/>
+              <w:bottom w:w="100" w:type="dxa"/>
+              <w:right w:w="140" w:type="dxa"/>
+            </w:tcMar>
+          </w:tcPr>
+          <w:p>
+            <w:pPr>
+              <w:spacing w:before="40" w:after="40"/>
+            </w:pPr>
+            <w:r>
+              <w:rPr>
+                <w:sz w:val="19"/>
+                <w:szCs w:val="19"/>
+              </w:rPr>
+              <w:t>☐  Yes — describe:</w:t>
+            </w:r>
+          </w:p>
+          <w:p>
+            <w:pPr>
+              <w:spacing w:before="40" w:after="40"/>
+            </w:pPr>
+            <w:r>
+              <w:rPr>
+                <w:sz w:val="19"/>
+                <w:szCs w:val="19"/>
+              </w:rPr>
+              <w:t>☐  No — single scope</w:t>
+            </w:r>
+          </w:p>
+        </w:tc>
+      </w:tr>
+      <w:tr>
+        <w:tc>
+          <w:tcPr>
+            <w:tcW w:w="2800" w:type="dxa"/>
+            <w:tcBorders>
+              <w:top w:val="single" w:sz="4" w:space="0" w:color="BBBBBB"/>
+              <w:left w:val="single" w:sz="4" w:space="0" w:color="BBBBBB"/>
+              <w:bottom w:val="single" w:sz="4" w:space="0" w:color="BBBBBB"/>
+              <w:right w:val="single" w:sz="4" w:space="0" w:color="BBBBBB"/>
+            </w:tcBorders>
+            <w:shd w:val="clear" w:color="auto" w:fill="EBF3FB"/>
+            <w:tcMar>
+              <w:top w:w="100" w:type="dxa"/>
+              <w:left w:w="140" w:type="dxa"/>
+              <w:bottom w:w="100" w:type="dxa"/>
+              <w:right w:w="140" w:type="dxa"/>
+            </w:tcMar>
+          </w:tcPr>
+          <w:p>
+            <w:r>
+              <w:rPr>
+                <w:b/>
+                <w:bCs/>
+                <w:color w:val="404040"/>
+                <w:sz w:val="19"/>
+                <w:szCs w:val="19"/>
+              </w:rPr>
+              <w:t>All Tiers Accessible?</w:t>
+            </w:r>
+          </w:p>
+        </w:tc>
+        <w:tc>
+          <w:tcPr>
+            <w:tcW w:w="6560" w:type="dxa"/>
+            <w:tcBorders>
+              <w:top w:val="single" w:sz="4" w:space="0" w:color="BBBBBB"/>
+              <w:left w:val="single" w:sz="4" w:space="0" w:color="BBBBBB"/>
+              <w:bottom w:val="single" w:sz="4" w:space="0" w:color="BBBBBB"/>
+              <w:right w:val="single" w:sz="4" w:space="0" w:color="BBBBBB"/>
+            </w:tcBorders>
+            <w:tcMar>
+              <w:top w:w="100" w:type="dxa"/>
+              <w:left w:w="140" w:type="dxa"/>
+              <w:bottom w:w="100" w:type="dxa"/>
+              <w:right w:w="140" w:type="dxa"/>
+            </w:tcMar>
+          </w:tcPr>
+          <w:p>
+            <w:pPr>
+              <w:spacing w:before="40" w:after="40"/>
+            </w:pPr>
+            <w:r>
+              <w:rPr>
+                <w:sz w:val="19"/>
+                <w:szCs w:val="19"/>
+              </w:rPr>
+              <w:t>☐  Yes</w:t>
+            </w:r>
+          </w:p>
+          <w:p>
+            <w:pPr>
+              <w:spacing w:before="40" w:after="40"/>
+            </w:pPr>
+            <w:r>
+              <w:rPr>
+                <w:sz w:val="19"/>
+                <w:szCs w:val="19"/>
+              </w:rPr>
+              <w:t>☐  No — describe gaps:</w:t>
+            </w:r>
+          </w:p>
+        </w:tc>
+      </w:tr>
+      <w:tr>
+        <w:tc>
+          <w:tcPr>
+            <w:tcW w:w="2800" w:type="dxa"/>
+            <w:tcBorders>
+              <w:top w:val="single" w:sz="4" w:space="0" w:color="BBBBBB"/>
+              <w:left w:val="single" w:sz="4" w:space="0" w:color="BBBBBB"/>
+              <w:bottom w:val="single" w:sz="4" w:space="0" w:color="BBBBBB"/>
+              <w:right w:val="single" w:sz="4" w:space="0" w:color="BBBBBB"/>
+            </w:tcBorders>
+            <w:shd w:val="clear" w:color="auto" w:fill="EBF3FB"/>
+            <w:tcMar>
+              <w:top w:w="100" w:type="dxa"/>
+              <w:left w:w="140" w:type="dxa"/>
+              <w:bottom w:w="100" w:type="dxa"/>
+              <w:right w:w="140" w:type="dxa"/>
+            </w:tcMar>
+          </w:tcPr>
+          <w:p>
+            <w:r>
+              <w:rPr>
+                <w:b/>
+                <w:bCs/>
+                <w:color w:val="404040"/>
+                <w:sz w:val="19"/>
+                <w:szCs w:val="19"/>
+              </w:rPr>
+              <w:t>API Response Samples (if no lab)</w:t>
+            </w:r>
+          </w:p>
+        </w:tc>
+        <w:tc>
+          <w:tcPr>
+            <w:tcW w:w="6560" w:type="dxa"/>
+            <w:tcBorders>
+              <w:top w:val="single" w:sz="4" w:space="0" w:color="BBBBBB"/>
+              <w:left w:val="single" w:sz="4" w:space="0" w:color="BBBBBB"/>
+              <w:bottom w:val="single" w:sz="4" w:space="0" w:color="BBBBBB"/>
+              <w:right w:val="single" w:sz="4" w:space="0" w:color="BBBBBB"/>
+            </w:tcBorders>
+            <w:tcMar>
+              <w:top w:w="100" w:type="dxa"/>
+              <w:left w:w="140" w:type="dxa"/>
+              <w:bottom w:w="100" w:type="dxa"/>
+              <w:right w:w="140" w:type="dxa"/>
+            </w:tcMar>
+          </w:tcPr>
+          <w:p>
             <w:r>
               <w:rPr>
                 <w:i/>
@@ -20021,571 +19282,12 @@
                 <w:sz w:val="19"/>
                 <w:szCs w:val="19"/>
               </w:rPr>
-              <w:t xml:space="preserve"> present</w:t>
-            </w:r>
-          </w:p>
-        </w:tc>
-      </w:tr>
-      <w:tr>
-        <w:tblPrEx>
-          <w:tblCellMar>
-            <w:top w:w="0" w:type="dxa"/>
-            <w:bottom w:w="0" w:type="dxa"/>
-          </w:tblCellMar>
-        </w:tblPrEx>
-        <w:tc>
-          <w:tcPr>
-            <w:tcW w:w="2800" w:type="dxa"/>
-            <w:tcBorders>
-              <w:top w:val="single" w:sz="4" w:space="0" w:color="BBBBBB"/>
-              <w:left w:val="single" w:sz="4" w:space="0" w:color="BBBBBB"/>
-              <w:bottom w:val="single" w:sz="4" w:space="0" w:color="BBBBBB"/>
-              <w:right w:val="single" w:sz="4" w:space="0" w:color="BBBBBB"/>
-            </w:tcBorders>
-            <w:shd w:val="clear" w:color="auto" w:fill="EBF3FB"/>
-            <w:tcMar>
-              <w:top w:w="100" w:type="dxa"/>
-              <w:left w:w="140" w:type="dxa"/>
-              <w:bottom w:w="100" w:type="dxa"/>
-              <w:right w:w="140" w:type="dxa"/>
-            </w:tcMar>
-          </w:tcPr>
-          <w:p>
-            <w:r>
-              <w:rPr>
-                <w:b/>
-                <w:bCs/>
-                <w:color w:val="404040"/>
-                <w:sz w:val="19"/>
-                <w:szCs w:val="19"/>
-              </w:rPr>
-              <w:t>Network Reachability</w:t>
-            </w:r>
-          </w:p>
-        </w:tc>
-        <w:tc>
-          <w:tcPr>
-            <w:tcW w:w="6560" w:type="dxa"/>
-            <w:tcBorders>
-              <w:top w:val="single" w:sz="4" w:space="0" w:color="BBBBBB"/>
-              <w:left w:val="single" w:sz="4" w:space="0" w:color="BBBBBB"/>
-              <w:bottom w:val="single" w:sz="4" w:space="0" w:color="BBBBBB"/>
-              <w:right w:val="single" w:sz="4" w:space="0" w:color="BBBBBB"/>
-            </w:tcBorders>
-            <w:tcMar>
-              <w:top w:w="100" w:type="dxa"/>
-              <w:left w:w="140" w:type="dxa"/>
-              <w:bottom w:w="100" w:type="dxa"/>
-              <w:right w:w="140" w:type="dxa"/>
-            </w:tcMar>
-          </w:tcPr>
-          <w:p>
-            <w:pPr>
-              <w:spacing w:before="40" w:after="40"/>
-            </w:pPr>
-            <w:r>
-              <w:rPr>
-                <w:sz w:val="19"/>
-                <w:szCs w:val="19"/>
-              </w:rPr>
-              <w:t>☐  Direct access</w:t>
-            </w:r>
-          </w:p>
-          <w:p>
-            <w:pPr>
-              <w:spacing w:before="40" w:after="40"/>
-            </w:pPr>
-            <w:r>
-              <w:rPr>
-                <w:sz w:val="19"/>
-                <w:szCs w:val="19"/>
-              </w:rPr>
-              <w:t>☐  VPN required</w:t>
-            </w:r>
-          </w:p>
-          <w:p>
-            <w:pPr>
-              <w:spacing w:before="40" w:after="40"/>
-            </w:pPr>
-            <w:r>
-              <w:rPr>
-                <w:sz w:val="19"/>
-                <w:szCs w:val="19"/>
-              </w:rPr>
-              <w:t>☐  Jump host required</w:t>
-            </w:r>
-          </w:p>
-        </w:tc>
-      </w:tr>
-      <w:tr>
-        <w:tblPrEx>
-          <w:tblCellMar>
-            <w:top w:w="0" w:type="dxa"/>
-            <w:bottom w:w="0" w:type="dxa"/>
-          </w:tblCellMar>
-        </w:tblPrEx>
-        <w:tc>
-          <w:tcPr>
-            <w:tcW w:w="2800" w:type="dxa"/>
-            <w:tcBorders>
-              <w:top w:val="single" w:sz="4" w:space="0" w:color="BBBBBB"/>
-              <w:left w:val="single" w:sz="4" w:space="0" w:color="BBBBBB"/>
-              <w:bottom w:val="single" w:sz="4" w:space="0" w:color="BBBBBB"/>
-              <w:right w:val="single" w:sz="4" w:space="0" w:color="BBBBBB"/>
-            </w:tcBorders>
-            <w:shd w:val="clear" w:color="auto" w:fill="EBF3FB"/>
-            <w:tcMar>
-              <w:top w:w="100" w:type="dxa"/>
-              <w:left w:w="140" w:type="dxa"/>
-              <w:bottom w:w="100" w:type="dxa"/>
-              <w:right w:w="140" w:type="dxa"/>
-            </w:tcMar>
-          </w:tcPr>
-          <w:p>
-            <w:r>
-              <w:rPr>
-                <w:b/>
-                <w:bCs/>
-                <w:color w:val="404040"/>
-                <w:sz w:val="19"/>
-                <w:szCs w:val="19"/>
-              </w:rPr>
-              <w:t>Test Data Populated?</w:t>
-            </w:r>
-          </w:p>
-        </w:tc>
-        <w:tc>
-          <w:tcPr>
-            <w:tcW w:w="6560" w:type="dxa"/>
-            <w:tcBorders>
-              <w:top w:val="single" w:sz="4" w:space="0" w:color="BBBBBB"/>
-              <w:left w:val="single" w:sz="4" w:space="0" w:color="BBBBBB"/>
-              <w:bottom w:val="single" w:sz="4" w:space="0" w:color="BBBBBB"/>
-              <w:right w:val="single" w:sz="4" w:space="0" w:color="BBBBBB"/>
-            </w:tcBorders>
-            <w:tcMar>
-              <w:top w:w="100" w:type="dxa"/>
-              <w:left w:w="140" w:type="dxa"/>
-              <w:bottom w:w="100" w:type="dxa"/>
-              <w:right w:w="140" w:type="dxa"/>
-            </w:tcMar>
-          </w:tcPr>
-          <w:p>
-            <w:r>
-              <w:rPr>
-                <w:i/>
-                <w:iCs/>
-                <w:color w:val="AAAAAA"/>
-                <w:sz w:val="19"/>
-                <w:szCs w:val="19"/>
-              </w:rPr>
-              <w:t>Are route tables, ARP/MAC, topology, and policy data populated?</w:t>
-            </w:r>
-          </w:p>
-        </w:tc>
-      </w:tr>
-      <w:tr>
-        <w:tblPrEx>
-          <w:tblCellMar>
-            <w:top w:w="0" w:type="dxa"/>
-            <w:bottom w:w="0" w:type="dxa"/>
-          </w:tblCellMar>
-        </w:tblPrEx>
-        <w:tc>
-          <w:tcPr>
-            <w:tcW w:w="2800" w:type="dxa"/>
-            <w:tcBorders>
-              <w:top w:val="single" w:sz="4" w:space="0" w:color="BBBBBB"/>
-              <w:left w:val="single" w:sz="4" w:space="0" w:color="BBBBBB"/>
-              <w:bottom w:val="single" w:sz="4" w:space="0" w:color="BBBBBB"/>
-              <w:right w:val="single" w:sz="4" w:space="0" w:color="BBBBBB"/>
-            </w:tcBorders>
-            <w:shd w:val="clear" w:color="auto" w:fill="EBF3FB"/>
-            <w:tcMar>
-              <w:top w:w="100" w:type="dxa"/>
-              <w:left w:w="140" w:type="dxa"/>
-              <w:bottom w:w="100" w:type="dxa"/>
-              <w:right w:w="140" w:type="dxa"/>
-            </w:tcMar>
-          </w:tcPr>
-          <w:p>
-            <w:r>
-              <w:rPr>
-                <w:b/>
-                <w:bCs/>
-                <w:color w:val="404040"/>
-                <w:sz w:val="19"/>
-                <w:szCs w:val="19"/>
-              </w:rPr>
-              <w:t>Real-time API Available?</w:t>
-            </w:r>
-          </w:p>
-        </w:tc>
-        <w:tc>
-          <w:tcPr>
-            <w:tcW w:w="6560" w:type="dxa"/>
-            <w:tcBorders>
-              <w:top w:val="single" w:sz="4" w:space="0" w:color="BBBBBB"/>
-              <w:left w:val="single" w:sz="4" w:space="0" w:color="BBBBBB"/>
-              <w:bottom w:val="single" w:sz="4" w:space="0" w:color="BBBBBB"/>
-              <w:right w:val="single" w:sz="4" w:space="0" w:color="BBBBBB"/>
-            </w:tcBorders>
-            <w:tcMar>
-              <w:top w:w="100" w:type="dxa"/>
-              <w:left w:w="140" w:type="dxa"/>
-              <w:bottom w:w="100" w:type="dxa"/>
-              <w:right w:w="140" w:type="dxa"/>
-            </w:tcMar>
-          </w:tcPr>
-          <w:p>
-            <w:pPr>
-              <w:spacing w:before="40" w:after="40"/>
-            </w:pPr>
-            <w:r>
-              <w:rPr>
-                <w:sz w:val="19"/>
-                <w:szCs w:val="19"/>
-              </w:rPr>
-              <w:t>☐  Yes</w:t>
-            </w:r>
-          </w:p>
-          <w:p>
-            <w:pPr>
-              <w:spacing w:before="40" w:after="40"/>
-            </w:pPr>
-            <w:r>
-              <w:rPr>
-                <w:sz w:val="19"/>
-                <w:szCs w:val="19"/>
-              </w:rPr>
-              <w:t>☐  No</w:t>
-            </w:r>
-          </w:p>
-        </w:tc>
-      </w:tr>
-      <w:tr>
-        <w:tblPrEx>
-          <w:tblCellMar>
-            <w:top w:w="0" w:type="dxa"/>
-            <w:bottom w:w="0" w:type="dxa"/>
-          </w:tblCellMar>
-        </w:tblPrEx>
-        <w:tc>
-          <w:tcPr>
-            <w:tcW w:w="2800" w:type="dxa"/>
-            <w:tcBorders>
-              <w:top w:val="single" w:sz="4" w:space="0" w:color="BBBBBB"/>
-              <w:left w:val="single" w:sz="4" w:space="0" w:color="BBBBBB"/>
-              <w:bottom w:val="single" w:sz="4" w:space="0" w:color="BBBBBB"/>
-              <w:right w:val="single" w:sz="4" w:space="0" w:color="BBBBBB"/>
-            </w:tcBorders>
-            <w:shd w:val="clear" w:color="auto" w:fill="EBF3FB"/>
-            <w:tcMar>
-              <w:top w:w="100" w:type="dxa"/>
-              <w:left w:w="140" w:type="dxa"/>
-              <w:bottom w:w="100" w:type="dxa"/>
-              <w:right w:w="140" w:type="dxa"/>
-            </w:tcMar>
-          </w:tcPr>
-          <w:p>
-            <w:r>
-              <w:rPr>
-                <w:b/>
-                <w:bCs/>
-                <w:color w:val="404040"/>
-                <w:sz w:val="19"/>
-                <w:szCs w:val="19"/>
-              </w:rPr>
-              <w:lastRenderedPageBreak/>
-              <w:t>SDK Installed on Server?</w:t>
-            </w:r>
-          </w:p>
-        </w:tc>
-        <w:tc>
-          <w:tcPr>
-            <w:tcW w:w="6560" w:type="dxa"/>
-            <w:tcBorders>
-              <w:top w:val="single" w:sz="4" w:space="0" w:color="BBBBBB"/>
-              <w:left w:val="single" w:sz="4" w:space="0" w:color="BBBBBB"/>
-              <w:bottom w:val="single" w:sz="4" w:space="0" w:color="BBBBBB"/>
-              <w:right w:val="single" w:sz="4" w:space="0" w:color="BBBBBB"/>
-            </w:tcBorders>
-            <w:tcMar>
-              <w:top w:w="100" w:type="dxa"/>
-              <w:left w:w="140" w:type="dxa"/>
-              <w:bottom w:w="100" w:type="dxa"/>
-              <w:right w:w="140" w:type="dxa"/>
-            </w:tcMar>
-          </w:tcPr>
-          <w:p>
-            <w:pPr>
-              <w:spacing w:before="40" w:after="40"/>
-            </w:pPr>
-            <w:r>
-              <w:rPr>
-                <w:sz w:val="19"/>
-                <w:szCs w:val="19"/>
-              </w:rPr>
-              <w:t>☐  Yes</w:t>
-            </w:r>
-          </w:p>
-          <w:p>
-            <w:pPr>
-              <w:spacing w:before="40" w:after="40"/>
-            </w:pPr>
-            <w:r>
-              <w:rPr>
-                <w:sz w:val="19"/>
-                <w:szCs w:val="19"/>
-              </w:rPr>
-              <w:t>☐  No</w:t>
-            </w:r>
-          </w:p>
-          <w:p>
-            <w:pPr>
-              <w:spacing w:before="40" w:after="40"/>
-            </w:pPr>
-            <w:r>
-              <w:rPr>
-                <w:sz w:val="19"/>
-                <w:szCs w:val="19"/>
-              </w:rPr>
-              <w:t>☐  N/A</w:t>
-            </w:r>
-          </w:p>
-        </w:tc>
-      </w:tr>
-      <w:tr>
-        <w:tblPrEx>
-          <w:tblCellMar>
-            <w:top w:w="0" w:type="dxa"/>
-            <w:bottom w:w="0" w:type="dxa"/>
-          </w:tblCellMar>
-        </w:tblPrEx>
-        <w:tc>
-          <w:tcPr>
-            <w:tcW w:w="2800" w:type="dxa"/>
-            <w:tcBorders>
-              <w:top w:val="single" w:sz="4" w:space="0" w:color="BBBBBB"/>
-              <w:left w:val="single" w:sz="4" w:space="0" w:color="BBBBBB"/>
-              <w:bottom w:val="single" w:sz="4" w:space="0" w:color="BBBBBB"/>
-              <w:right w:val="single" w:sz="4" w:space="0" w:color="BBBBBB"/>
-            </w:tcBorders>
-            <w:shd w:val="clear" w:color="auto" w:fill="EBF3FB"/>
-            <w:tcMar>
-              <w:top w:w="100" w:type="dxa"/>
-              <w:left w:w="140" w:type="dxa"/>
-              <w:bottom w:w="100" w:type="dxa"/>
-              <w:right w:w="140" w:type="dxa"/>
-            </w:tcMar>
-          </w:tcPr>
-          <w:p>
-            <w:r>
-              <w:rPr>
-                <w:b/>
-                <w:bCs/>
-                <w:color w:val="404040"/>
-                <w:sz w:val="19"/>
-                <w:szCs w:val="19"/>
-              </w:rPr>
-              <w:t>Multi-region / Multi-account?</w:t>
-            </w:r>
-          </w:p>
-        </w:tc>
-        <w:tc>
-          <w:tcPr>
-            <w:tcW w:w="6560" w:type="dxa"/>
-            <w:tcBorders>
-              <w:top w:val="single" w:sz="4" w:space="0" w:color="BBBBBB"/>
-              <w:left w:val="single" w:sz="4" w:space="0" w:color="BBBBBB"/>
-              <w:bottom w:val="single" w:sz="4" w:space="0" w:color="BBBBBB"/>
-              <w:right w:val="single" w:sz="4" w:space="0" w:color="BBBBBB"/>
-            </w:tcBorders>
-            <w:tcMar>
-              <w:top w:w="100" w:type="dxa"/>
-              <w:left w:w="140" w:type="dxa"/>
-              <w:bottom w:w="100" w:type="dxa"/>
-              <w:right w:w="140" w:type="dxa"/>
-            </w:tcMar>
-          </w:tcPr>
-          <w:p>
-            <w:pPr>
-              <w:spacing w:before="40" w:after="40"/>
-            </w:pPr>
-            <w:r>
-              <w:rPr>
-                <w:sz w:val="19"/>
-                <w:szCs w:val="19"/>
-              </w:rPr>
-              <w:t>☐  Yes — describe:</w:t>
-            </w:r>
-          </w:p>
-          <w:p>
-            <w:pPr>
-              <w:spacing w:before="40" w:after="40"/>
-            </w:pPr>
-            <w:r>
-              <w:rPr>
-                <w:sz w:val="19"/>
-                <w:szCs w:val="19"/>
-              </w:rPr>
-              <w:t>☐  No — single scope</w:t>
-            </w:r>
-          </w:p>
-        </w:tc>
-      </w:tr>
-      <w:tr>
-        <w:tblPrEx>
-          <w:tblCellMar>
-            <w:top w:w="0" w:type="dxa"/>
-            <w:bottom w:w="0" w:type="dxa"/>
-          </w:tblCellMar>
-        </w:tblPrEx>
-        <w:tc>
-          <w:tcPr>
-            <w:tcW w:w="2800" w:type="dxa"/>
-            <w:tcBorders>
-              <w:top w:val="single" w:sz="4" w:space="0" w:color="BBBBBB"/>
-              <w:left w:val="single" w:sz="4" w:space="0" w:color="BBBBBB"/>
-              <w:bottom w:val="single" w:sz="4" w:space="0" w:color="BBBBBB"/>
-              <w:right w:val="single" w:sz="4" w:space="0" w:color="BBBBBB"/>
-            </w:tcBorders>
-            <w:shd w:val="clear" w:color="auto" w:fill="EBF3FB"/>
-            <w:tcMar>
-              <w:top w:w="100" w:type="dxa"/>
-              <w:left w:w="140" w:type="dxa"/>
-              <w:bottom w:w="100" w:type="dxa"/>
-              <w:right w:w="140" w:type="dxa"/>
-            </w:tcMar>
-          </w:tcPr>
-          <w:p>
-            <w:r>
-              <w:rPr>
-                <w:b/>
-                <w:bCs/>
-                <w:color w:val="404040"/>
-                <w:sz w:val="19"/>
-                <w:szCs w:val="19"/>
-              </w:rPr>
-              <w:t>All Tiers Accessible?</w:t>
-            </w:r>
-          </w:p>
-        </w:tc>
-        <w:tc>
-          <w:tcPr>
-            <w:tcW w:w="6560" w:type="dxa"/>
-            <w:tcBorders>
-              <w:top w:val="single" w:sz="4" w:space="0" w:color="BBBBBB"/>
-              <w:left w:val="single" w:sz="4" w:space="0" w:color="BBBBBB"/>
-              <w:bottom w:val="single" w:sz="4" w:space="0" w:color="BBBBBB"/>
-              <w:right w:val="single" w:sz="4" w:space="0" w:color="BBBBBB"/>
-            </w:tcBorders>
-            <w:tcMar>
-              <w:top w:w="100" w:type="dxa"/>
-              <w:left w:w="140" w:type="dxa"/>
-              <w:bottom w:w="100" w:type="dxa"/>
-              <w:right w:w="140" w:type="dxa"/>
-            </w:tcMar>
-          </w:tcPr>
-          <w:p>
-            <w:pPr>
-              <w:spacing w:before="40" w:after="40"/>
-            </w:pPr>
-            <w:r>
-              <w:rPr>
-                <w:sz w:val="19"/>
-                <w:szCs w:val="19"/>
-              </w:rPr>
-              <w:t>☐  Yes</w:t>
-            </w:r>
-          </w:p>
-          <w:p>
-            <w:pPr>
-              <w:spacing w:before="40" w:after="40"/>
-            </w:pPr>
-            <w:r>
-              <w:rPr>
-                <w:sz w:val="19"/>
-                <w:szCs w:val="19"/>
-              </w:rPr>
-              <w:t>☐  No — describe gaps:</w:t>
-            </w:r>
-          </w:p>
-        </w:tc>
-      </w:tr>
-      <w:tr>
-        <w:tblPrEx>
-          <w:tblCellMar>
-            <w:top w:w="0" w:type="dxa"/>
-            <w:bottom w:w="0" w:type="dxa"/>
-          </w:tblCellMar>
-        </w:tblPrEx>
-        <w:tc>
-          <w:tcPr>
-            <w:tcW w:w="2800" w:type="dxa"/>
-            <w:tcBorders>
-              <w:top w:val="single" w:sz="4" w:space="0" w:color="BBBBBB"/>
-              <w:left w:val="single" w:sz="4" w:space="0" w:color="BBBBBB"/>
-              <w:bottom w:val="single" w:sz="4" w:space="0" w:color="BBBBBB"/>
-              <w:right w:val="single" w:sz="4" w:space="0" w:color="BBBBBB"/>
-            </w:tcBorders>
-            <w:shd w:val="clear" w:color="auto" w:fill="EBF3FB"/>
-            <w:tcMar>
-              <w:top w:w="100" w:type="dxa"/>
-              <w:left w:w="140" w:type="dxa"/>
-              <w:bottom w:w="100" w:type="dxa"/>
-              <w:right w:w="140" w:type="dxa"/>
-            </w:tcMar>
-          </w:tcPr>
-          <w:p>
-            <w:r>
-              <w:rPr>
-                <w:b/>
-                <w:bCs/>
-                <w:color w:val="404040"/>
-                <w:sz w:val="19"/>
-                <w:szCs w:val="19"/>
-              </w:rPr>
-              <w:t>API Response Samples (if no lab)</w:t>
-            </w:r>
-          </w:p>
-        </w:tc>
-        <w:tc>
-          <w:tcPr>
-            <w:tcW w:w="6560" w:type="dxa"/>
-            <w:tcBorders>
-              <w:top w:val="single" w:sz="4" w:space="0" w:color="BBBBBB"/>
-              <w:left w:val="single" w:sz="4" w:space="0" w:color="BBBBBB"/>
-              <w:bottom w:val="single" w:sz="4" w:space="0" w:color="BBBBBB"/>
-              <w:right w:val="single" w:sz="4" w:space="0" w:color="BBBBBB"/>
-            </w:tcBorders>
-            <w:tcMar>
-              <w:top w:w="100" w:type="dxa"/>
-              <w:left w:w="140" w:type="dxa"/>
-              <w:bottom w:w="100" w:type="dxa"/>
-              <w:right w:w="140" w:type="dxa"/>
-            </w:tcMar>
-          </w:tcPr>
-          <w:p>
-            <w:r>
-              <w:rPr>
-                <w:i/>
-                <w:iCs/>
-                <w:color w:val="AAAAAA"/>
-                <w:sz w:val="19"/>
-                <w:szCs w:val="19"/>
-              </w:rPr>
               <w:t>Attach or link raw JSON/XML response files for all Section 4 endpoints</w:t>
             </w:r>
           </w:p>
         </w:tc>
       </w:tr>
     </w:tbl>
-    <w:p>
-      <w:pPr>
-        <w:spacing w:after="200"/>
-      </w:pPr>
-    </w:p>
     <w:p>
       <w:pPr>
         <w:pStyle w:val="Heading1"/>
@@ -20647,12 +19349,6 @@
         <w:gridCol w:w="6560"/>
       </w:tblGrid>
       <w:tr>
-        <w:tblPrEx>
-          <w:tblCellMar>
-            <w:top w:w="0" w:type="dxa"/>
-            <w:bottom w:w="0" w:type="dxa"/>
-          </w:tblCellMar>
-        </w:tblPrEx>
         <w:tc>
           <w:tcPr>
             <w:tcW w:w="2800" w:type="dxa"/>
@@ -20714,12 +19410,6 @@
         </w:tc>
       </w:tr>
       <w:tr>
-        <w:tblPrEx>
-          <w:tblCellMar>
-            <w:top w:w="0" w:type="dxa"/>
-            <w:bottom w:w="0" w:type="dxa"/>
-          </w:tblCellMar>
-        </w:tblPrEx>
         <w:tc>
           <w:tcPr>
             <w:tcW w:w="2800" w:type="dxa"/>
@@ -20781,12 +19471,6 @@
         </w:tc>
       </w:tr>
       <w:tr>
-        <w:tblPrEx>
-          <w:tblCellMar>
-            <w:top w:w="0" w:type="dxa"/>
-            <w:bottom w:w="0" w:type="dxa"/>
-          </w:tblCellMar>
-        </w:tblPrEx>
         <w:tc>
           <w:tcPr>
             <w:tcW w:w="2800" w:type="dxa"/>
@@ -20848,12 +19532,6 @@
         </w:tc>
       </w:tr>
       <w:tr>
-        <w:tblPrEx>
-          <w:tblCellMar>
-            <w:top w:w="0" w:type="dxa"/>
-            <w:bottom w:w="0" w:type="dxa"/>
-          </w:tblCellMar>
-        </w:tblPrEx>
         <w:tc>
           <w:tcPr>
             <w:tcW w:w="2800" w:type="dxa"/>
@@ -20880,6 +19558,7 @@
                 <w:sz w:val="19"/>
                 <w:szCs w:val="19"/>
               </w:rPr>
+              <w:lastRenderedPageBreak/>
               <w:t>API Server Password / Secret</w:t>
             </w:r>
           </w:p>
@@ -20915,12 +19594,6 @@
         </w:tc>
       </w:tr>
       <w:tr>
-        <w:tblPrEx>
-          <w:tblCellMar>
-            <w:top w:w="0" w:type="dxa"/>
-            <w:bottom w:w="0" w:type="dxa"/>
-          </w:tblCellMar>
-        </w:tblPrEx>
         <w:tc>
           <w:tcPr>
             <w:tcW w:w="2800" w:type="dxa"/>
@@ -20982,12 +19655,6 @@
         </w:tc>
       </w:tr>
       <w:tr>
-        <w:tblPrEx>
-          <w:tblCellMar>
-            <w:top w:w="0" w:type="dxa"/>
-            <w:bottom w:w="0" w:type="dxa"/>
-          </w:tblCellMar>
-        </w:tblPrEx>
         <w:tc>
           <w:tcPr>
             <w:tcW w:w="2800" w:type="dxa"/>
@@ -21049,11 +19716,6 @@
         </w:tc>
       </w:tr>
     </w:tbl>
-    <w:p>
-      <w:pPr>
-        <w:spacing w:after="200"/>
-      </w:pPr>
-    </w:p>
     <w:p>
       <w:pPr>
         <w:pStyle w:val="Heading1"/>

</xml_diff>